<commit_message>
Equation numbers inside display math; README points to the research system
Co-Authored-By: Claude Fable 5.1 <noreply@anthropic.com>
Claude-Session: https://claude.ai/code/session_01BowwkLMYwXCaivyHiAeZQc
</commit_message>
<xml_diff>
--- a/paper/manuscript.docx
+++ b/paper/manuscript.docx
@@ -949,10 +949,14 @@
             </m:sup>
           </m:sSup>
           <m:r>
+            <m:t>  </m:t>
+          </m:r>
+          <m:r>
             <m:rPr>
+              <m:nor/>
               <m:sty m:val="p"/>
             </m:rPr>
-            <m:t>.</m:t>
+            <m:t>(1)</m:t>
           </m:r>
         </m:oMath>
       </m:oMathPara>
@@ -1210,10 +1214,14 @@
             </m:e>
           </m:d>
           <m:r>
+            <m:t>  </m:t>
+          </m:r>
+          <m:r>
             <m:rPr>
+              <m:nor/>
               <m:sty m:val="p"/>
             </m:rPr>
-            <m:t>,</m:t>
+            <m:t>(2)</m:t>
           </m:r>
         </m:oMath>
       </m:oMathPara>
@@ -1365,10 +1373,14 @@
             </m:e>
           </m:d>
           <m:r>
+            <m:t>  </m:t>
+          </m:r>
+          <m:r>
             <m:rPr>
+              <m:nor/>
               <m:sty m:val="p"/>
             </m:rPr>
-            <m:t>.</m:t>
+            <m:t>(3)</m:t>
           </m:r>
         </m:oMath>
       </m:oMathPara>
@@ -18214,261 +18226,6 @@
       </w:pPr>
     </w:lvl>
   </w:abstractNum>
-  <w:abstractNum w:abstractNumId="99431">
-    <w:nsid w:val="A99431"/>
-    <w:multiLevelType w:val="multilevel"/>
-    <w:lvl w:ilvl="0">
-      <w:start w:val="1"/>
-      <w:numFmt w:val="decimal"/>
-      <w:lvlText w:val="(%1)"/>
-      <w:lvlJc w:val="left"/>
-      <w:pPr>
-        <w:ind w:left="720" w:hanging="480"/>
-      </w:pPr>
-    </w:lvl>
-    <w:lvl w:ilvl="1">
-      <w:start w:val="1"/>
-      <w:numFmt w:val="decimal"/>
-      <w:lvlText w:val="(%2)"/>
-      <w:lvlJc w:val="left"/>
-      <w:pPr>
-        <w:ind w:left="1440" w:hanging="480"/>
-      </w:pPr>
-    </w:lvl>
-    <w:lvl w:ilvl="2">
-      <w:start w:val="1"/>
-      <w:numFmt w:val="decimal"/>
-      <w:lvlText w:val="(%3)"/>
-      <w:lvlJc w:val="left"/>
-      <w:pPr>
-        <w:ind w:left="2160" w:hanging="480"/>
-      </w:pPr>
-    </w:lvl>
-    <w:lvl w:ilvl="3">
-      <w:start w:val="1"/>
-      <w:numFmt w:val="decimal"/>
-      <w:lvlText w:val="(%4)"/>
-      <w:lvlJc w:val="left"/>
-      <w:pPr>
-        <w:ind w:left="2880" w:hanging="480"/>
-      </w:pPr>
-    </w:lvl>
-    <w:lvl w:ilvl="4">
-      <w:start w:val="1"/>
-      <w:numFmt w:val="decimal"/>
-      <w:lvlText w:val="(%5)"/>
-      <w:lvlJc w:val="left"/>
-      <w:pPr>
-        <w:ind w:left="3600" w:hanging="480"/>
-      </w:pPr>
-    </w:lvl>
-    <w:lvl w:ilvl="5">
-      <w:start w:val="1"/>
-      <w:numFmt w:val="decimal"/>
-      <w:lvlText w:val="(%6)"/>
-      <w:lvlJc w:val="left"/>
-      <w:pPr>
-        <w:ind w:left="4320" w:hanging="480"/>
-      </w:pPr>
-    </w:lvl>
-    <w:lvl w:ilvl="6">
-      <w:start w:val="1"/>
-      <w:numFmt w:val="decimal"/>
-      <w:lvlText w:val="(%7)"/>
-      <w:lvlJc w:val="left"/>
-      <w:pPr>
-        <w:ind w:left="5040" w:hanging="480"/>
-      </w:pPr>
-    </w:lvl>
-    <w:lvl w:ilvl="7">
-      <w:start w:val="1"/>
-      <w:numFmt w:val="decimal"/>
-      <w:lvlText w:val="(%8)"/>
-      <w:lvlJc w:val="left"/>
-      <w:pPr>
-        <w:ind w:left="5760" w:hanging="480"/>
-      </w:pPr>
-    </w:lvl>
-    <w:lvl w:ilvl="8">
-      <w:start w:val="1"/>
-      <w:numFmt w:val="decimal"/>
-      <w:lvlText w:val="(%9)"/>
-      <w:lvlJc w:val="left"/>
-      <w:pPr>
-        <w:ind w:left="6480" w:hanging="480"/>
-      </w:pPr>
-    </w:lvl>
-  </w:abstractNum>
-  <w:abstractNum w:abstractNumId="99432">
-    <w:nsid w:val="A99432"/>
-    <w:multiLevelType w:val="multilevel"/>
-    <w:lvl w:ilvl="0">
-      <w:start w:val="2"/>
-      <w:numFmt w:val="decimal"/>
-      <w:lvlText w:val="(%1)"/>
-      <w:lvlJc w:val="left"/>
-      <w:pPr>
-        <w:ind w:left="720" w:hanging="480"/>
-      </w:pPr>
-    </w:lvl>
-    <w:lvl w:ilvl="1">
-      <w:start w:val="2"/>
-      <w:numFmt w:val="decimal"/>
-      <w:lvlText w:val="(%2)"/>
-      <w:lvlJc w:val="left"/>
-      <w:pPr>
-        <w:ind w:left="1440" w:hanging="480"/>
-      </w:pPr>
-    </w:lvl>
-    <w:lvl w:ilvl="2">
-      <w:start w:val="2"/>
-      <w:numFmt w:val="decimal"/>
-      <w:lvlText w:val="(%3)"/>
-      <w:lvlJc w:val="left"/>
-      <w:pPr>
-        <w:ind w:left="2160" w:hanging="480"/>
-      </w:pPr>
-    </w:lvl>
-    <w:lvl w:ilvl="3">
-      <w:start w:val="2"/>
-      <w:numFmt w:val="decimal"/>
-      <w:lvlText w:val="(%4)"/>
-      <w:lvlJc w:val="left"/>
-      <w:pPr>
-        <w:ind w:left="2880" w:hanging="480"/>
-      </w:pPr>
-    </w:lvl>
-    <w:lvl w:ilvl="4">
-      <w:start w:val="2"/>
-      <w:numFmt w:val="decimal"/>
-      <w:lvlText w:val="(%5)"/>
-      <w:lvlJc w:val="left"/>
-      <w:pPr>
-        <w:ind w:left="3600" w:hanging="480"/>
-      </w:pPr>
-    </w:lvl>
-    <w:lvl w:ilvl="5">
-      <w:start w:val="2"/>
-      <w:numFmt w:val="decimal"/>
-      <w:lvlText w:val="(%6)"/>
-      <w:lvlJc w:val="left"/>
-      <w:pPr>
-        <w:ind w:left="4320" w:hanging="480"/>
-      </w:pPr>
-    </w:lvl>
-    <w:lvl w:ilvl="6">
-      <w:start w:val="2"/>
-      <w:numFmt w:val="decimal"/>
-      <w:lvlText w:val="(%7)"/>
-      <w:lvlJc w:val="left"/>
-      <w:pPr>
-        <w:ind w:left="5040" w:hanging="480"/>
-      </w:pPr>
-    </w:lvl>
-    <w:lvl w:ilvl="7">
-      <w:start w:val="2"/>
-      <w:numFmt w:val="decimal"/>
-      <w:lvlText w:val="(%8)"/>
-      <w:lvlJc w:val="left"/>
-      <w:pPr>
-        <w:ind w:left="5760" w:hanging="480"/>
-      </w:pPr>
-    </w:lvl>
-    <w:lvl w:ilvl="8">
-      <w:start w:val="2"/>
-      <w:numFmt w:val="decimal"/>
-      <w:lvlText w:val="(%9)"/>
-      <w:lvlJc w:val="left"/>
-      <w:pPr>
-        <w:ind w:left="6480" w:hanging="480"/>
-      </w:pPr>
-    </w:lvl>
-  </w:abstractNum>
-  <w:abstractNum w:abstractNumId="99433">
-    <w:nsid w:val="A99433"/>
-    <w:multiLevelType w:val="multilevel"/>
-    <w:lvl w:ilvl="0">
-      <w:start w:val="3"/>
-      <w:numFmt w:val="decimal"/>
-      <w:lvlText w:val="(%1)"/>
-      <w:lvlJc w:val="left"/>
-      <w:pPr>
-        <w:ind w:left="720" w:hanging="480"/>
-      </w:pPr>
-    </w:lvl>
-    <w:lvl w:ilvl="1">
-      <w:start w:val="3"/>
-      <w:numFmt w:val="decimal"/>
-      <w:lvlText w:val="(%2)"/>
-      <w:lvlJc w:val="left"/>
-      <w:pPr>
-        <w:ind w:left="1440" w:hanging="480"/>
-      </w:pPr>
-    </w:lvl>
-    <w:lvl w:ilvl="2">
-      <w:start w:val="3"/>
-      <w:numFmt w:val="decimal"/>
-      <w:lvlText w:val="(%3)"/>
-      <w:lvlJc w:val="left"/>
-      <w:pPr>
-        <w:ind w:left="2160" w:hanging="480"/>
-      </w:pPr>
-    </w:lvl>
-    <w:lvl w:ilvl="3">
-      <w:start w:val="3"/>
-      <w:numFmt w:val="decimal"/>
-      <w:lvlText w:val="(%4)"/>
-      <w:lvlJc w:val="left"/>
-      <w:pPr>
-        <w:ind w:left="2880" w:hanging="480"/>
-      </w:pPr>
-    </w:lvl>
-    <w:lvl w:ilvl="4">
-      <w:start w:val="3"/>
-      <w:numFmt w:val="decimal"/>
-      <w:lvlText w:val="(%5)"/>
-      <w:lvlJc w:val="left"/>
-      <w:pPr>
-        <w:ind w:left="3600" w:hanging="480"/>
-      </w:pPr>
-    </w:lvl>
-    <w:lvl w:ilvl="5">
-      <w:start w:val="3"/>
-      <w:numFmt w:val="decimal"/>
-      <w:lvlText w:val="(%6)"/>
-      <w:lvlJc w:val="left"/>
-      <w:pPr>
-        <w:ind w:left="4320" w:hanging="480"/>
-      </w:pPr>
-    </w:lvl>
-    <w:lvl w:ilvl="6">
-      <w:start w:val="3"/>
-      <w:numFmt w:val="decimal"/>
-      <w:lvlText w:val="(%7)"/>
-      <w:lvlJc w:val="left"/>
-      <w:pPr>
-        <w:ind w:left="5040" w:hanging="480"/>
-      </w:pPr>
-    </w:lvl>
-    <w:lvl w:ilvl="7">
-      <w:start w:val="3"/>
-      <w:numFmt w:val="decimal"/>
-      <w:lvlText w:val="(%8)"/>
-      <w:lvlJc w:val="left"/>
-      <w:pPr>
-        <w:ind w:left="5760" w:hanging="480"/>
-      </w:pPr>
-    </w:lvl>
-    <w:lvl w:ilvl="8">
-      <w:start w:val="3"/>
-      <w:numFmt w:val="decimal"/>
-      <w:lvlText w:val="(%9)"/>
-      <w:lvlJc w:val="left"/>
-      <w:pPr>
-        <w:ind w:left="6480" w:hanging="480"/>
-      </w:pPr>
-    </w:lvl>
-  </w:abstractNum>
   <w:num w:numId="1000">
     <w:abstractNumId w:val="990"/>
   </w:num>
@@ -18500,96 +18257,6 @@
     </w:lvlOverride>
     <w:lvlOverride w:ilvl="8">
       <w:startOverride w:val="1"/>
-    </w:lvlOverride>
-  </w:num>
-  <w:num w:numId="1002">
-    <w:abstractNumId w:val="99431"/>
-    <w:lvlOverride w:ilvl="0">
-      <w:startOverride w:val="1"/>
-    </w:lvlOverride>
-    <w:lvlOverride w:ilvl="1">
-      <w:startOverride w:val="1"/>
-    </w:lvlOverride>
-    <w:lvlOverride w:ilvl="2">
-      <w:startOverride w:val="1"/>
-    </w:lvlOverride>
-    <w:lvlOverride w:ilvl="3">
-      <w:startOverride w:val="1"/>
-    </w:lvlOverride>
-    <w:lvlOverride w:ilvl="4">
-      <w:startOverride w:val="1"/>
-    </w:lvlOverride>
-    <w:lvlOverride w:ilvl="5">
-      <w:startOverride w:val="1"/>
-    </w:lvlOverride>
-    <w:lvlOverride w:ilvl="6">
-      <w:startOverride w:val="1"/>
-    </w:lvlOverride>
-    <w:lvlOverride w:ilvl="7">
-      <w:startOverride w:val="1"/>
-    </w:lvlOverride>
-    <w:lvlOverride w:ilvl="8">
-      <w:startOverride w:val="1"/>
-    </w:lvlOverride>
-  </w:num>
-  <w:num w:numId="1003">
-    <w:abstractNumId w:val="99432"/>
-    <w:lvlOverride w:ilvl="0">
-      <w:startOverride w:val="2"/>
-    </w:lvlOverride>
-    <w:lvlOverride w:ilvl="1">
-      <w:startOverride w:val="2"/>
-    </w:lvlOverride>
-    <w:lvlOverride w:ilvl="2">
-      <w:startOverride w:val="2"/>
-    </w:lvlOverride>
-    <w:lvlOverride w:ilvl="3">
-      <w:startOverride w:val="2"/>
-    </w:lvlOverride>
-    <w:lvlOverride w:ilvl="4">
-      <w:startOverride w:val="2"/>
-    </w:lvlOverride>
-    <w:lvlOverride w:ilvl="5">
-      <w:startOverride w:val="2"/>
-    </w:lvlOverride>
-    <w:lvlOverride w:ilvl="6">
-      <w:startOverride w:val="2"/>
-    </w:lvlOverride>
-    <w:lvlOverride w:ilvl="7">
-      <w:startOverride w:val="2"/>
-    </w:lvlOverride>
-    <w:lvlOverride w:ilvl="8">
-      <w:startOverride w:val="2"/>
-    </w:lvlOverride>
-  </w:num>
-  <w:num w:numId="1004">
-    <w:abstractNumId w:val="99433"/>
-    <w:lvlOverride w:ilvl="0">
-      <w:startOverride w:val="3"/>
-    </w:lvlOverride>
-    <w:lvlOverride w:ilvl="1">
-      <w:startOverride w:val="3"/>
-    </w:lvlOverride>
-    <w:lvlOverride w:ilvl="2">
-      <w:startOverride w:val="3"/>
-    </w:lvlOverride>
-    <w:lvlOverride w:ilvl="3">
-      <w:startOverride w:val="3"/>
-    </w:lvlOverride>
-    <w:lvlOverride w:ilvl="4">
-      <w:startOverride w:val="3"/>
-    </w:lvlOverride>
-    <w:lvlOverride w:ilvl="5">
-      <w:startOverride w:val="3"/>
-    </w:lvlOverride>
-    <w:lvlOverride w:ilvl="6">
-      <w:startOverride w:val="3"/>
-    </w:lvlOverride>
-    <w:lvlOverride w:ilvl="7">
-      <w:startOverride w:val="3"/>
-    </w:lvlOverride>
-    <w:lvlOverride w:ilvl="8">
-      <w:startOverride w:val="3"/>
     </w:lvlOverride>
   </w:num>
 </w:numbering>

</xml_diff>

<commit_message>
References verified against bibliographic sources; six entries corrected, one replaced, one uncited entry removed, DOIs added
Co-Authored-By: Claude Fable 5.1 <noreply@anthropic.com>
Claude-Session: https://claude.ai/code/session_01BowwkLMYwXCaivyHiAeZQc
</commit_message>
<xml_diff>
--- a/paper/manuscript.docx
+++ b/paper/manuscript.docx
@@ -476,7 +476,7 @@
       <w:r>
         <w:t xml:space="preserve"> </w:t>
       </w:r>
-      <w:hyperlink w:anchor="ref-feng2025metauad">
+      <w:hyperlink w:anchor="ref-feng2024metauad">
         <w:r>
           <w:rPr>
             <w:rStyle w:val="Hyperlink"/>
@@ -1538,12 +1538,12 @@
         </w:r>
       </w:hyperlink>
       <w:r>
-        <w:t xml:space="preserve">. Four patterns are usually distinguished: sudden, gradual (the two regimes are mixed over a transition period), incremental (a slow monotone shift) and recurring (earlier regimes return). Detection methods fall into three classes. Error-rate monitors need labelled feedback and are out of reach in unsupervised AD. Distribution monitors such as ADWIN</w:t>
-      </w:r>
-      <w:r>
-        <w:t xml:space="preserve"> </w:t>
-      </w:r>
-      <w:hyperlink w:anchor="ref-bifet2007adwin">
+        <w:t xml:space="preserve">. Four patterns are usually distinguished: sudden, gradual (the two regimes are mixed over a transition period), incremental (a slow monotone shift) and recurring (earlier regimes return). Detection methods fall into three classes. Error-rate monitors such as DDM</w:t>
+      </w:r>
+      <w:r>
+        <w:t xml:space="preserve"> </w:t>
+      </w:r>
+      <w:hyperlink w:anchor="ref-gama2004ddm">
         <w:r>
           <w:rPr>
             <w:rStyle w:val="Hyperlink"/>
@@ -1555,12 +1555,12 @@
         <w:t xml:space="preserve"> </w:t>
       </w:r>
       <w:r>
-        <w:t xml:space="preserve">watch a statistic of the stream and come with bounds on false positives and false negatives. Representation monitors watch the model’s own internal state, for example by comparing kernel embeddings with maximum mean discrepancy (MMD)</w:t>
-      </w:r>
-      <w:r>
-        <w:t xml:space="preserve"> </w:t>
-      </w:r>
-      <w:hyperlink w:anchor="ref-gretton2012mmd">
+        <w:t xml:space="preserve">need labelled feedback and are out of reach in unsupervised AD. Distribution monitors such as ADWIN</w:t>
+      </w:r>
+      <w:r>
+        <w:t xml:space="preserve"> </w:t>
+      </w:r>
+      <w:hyperlink w:anchor="ref-bifet2007adwin">
         <w:r>
           <w:rPr>
             <w:rStyle w:val="Hyperlink"/>
@@ -1569,12 +1569,15 @@
         </w:r>
       </w:hyperlink>
       <w:r>
-        <w:t xml:space="preserve">. Hinder et al. survey detection and adaptation in detail</w:t>
-      </w:r>
-      <w:r>
-        <w:t xml:space="preserve"> </w:t>
-      </w:r>
-      <w:hyperlink w:anchor="ref-hinder2024a">
+        <w:t xml:space="preserve"> </w:t>
+      </w:r>
+      <w:r>
+        <w:t xml:space="preserve">watch a statistic of the stream and come with bounds on false positives and false negatives. Representation monitors watch the model’s own internal state, for example by comparing kernel embeddings with maximum mean discrepancy (MMD)</w:t>
+      </w:r>
+      <w:r>
+        <w:t xml:space="preserve"> </w:t>
+      </w:r>
+      <w:hyperlink w:anchor="ref-gretton2012mmd">
         <w:r>
           <w:rPr>
             <w:rStyle w:val="Hyperlink"/>
@@ -1583,12 +1586,12 @@
         </w:r>
       </w:hyperlink>
       <w:r>
-        <w:t xml:space="preserve">,</w:t>
-      </w:r>
-      <w:r>
-        <w:t xml:space="preserve"> </w:t>
-      </w:r>
-      <w:hyperlink w:anchor="ref-hinder2024b">
+        <w:t xml:space="preserve">. Hinder et al. survey detection and adaptation in detail</w:t>
+      </w:r>
+      <w:r>
+        <w:t xml:space="preserve"> </w:t>
+      </w:r>
+      <w:hyperlink w:anchor="ref-hinder2024a">
         <w:r>
           <w:rPr>
             <w:rStyle w:val="Hyperlink"/>
@@ -1597,12 +1600,12 @@
         </w:r>
       </w:hyperlink>
       <w:r>
-        <w:t xml:space="preserve">. Continual learning supplies the tools for updating a model without forgetting what it knew</w:t>
-      </w:r>
-      <w:r>
-        <w:t xml:space="preserve"> </w:t>
-      </w:r>
-      <w:hyperlink w:anchor="ref-kirkpatrick2017ewc">
+        <w:t xml:space="preserve">,</w:t>
+      </w:r>
+      <w:r>
+        <w:t xml:space="preserve"> </w:t>
+      </w:r>
+      <w:hyperlink w:anchor="ref-hinder2024b">
         <w:r>
           <w:rPr>
             <w:rStyle w:val="Hyperlink"/>
@@ -1611,12 +1614,12 @@
         </w:r>
       </w:hyperlink>
       <w:r>
-        <w:t xml:space="preserve">,</w:t>
-      </w:r>
-      <w:r>
-        <w:t xml:space="preserve"> </w:t>
-      </w:r>
-      <w:hyperlink w:anchor="ref-rolnick2019replay">
+        <w:t xml:space="preserve">. Continual learning supplies the tools for updating a model without forgetting what it knew</w:t>
+      </w:r>
+      <w:r>
+        <w:t xml:space="preserve"> </w:t>
+      </w:r>
+      <w:hyperlink w:anchor="ref-kirkpatrick2017ewc">
         <w:r>
           <w:rPr>
             <w:rStyle w:val="Hyperlink"/>
@@ -1630,7 +1633,7 @@
       <w:r>
         <w:t xml:space="preserve"> </w:t>
       </w:r>
-      <w:hyperlink w:anchor="ref-wang2024continual">
+      <w:hyperlink w:anchor="ref-rolnick2019replay">
         <w:r>
           <w:rPr>
             <w:rStyle w:val="Hyperlink"/>
@@ -1639,6 +1642,20 @@
         </w:r>
       </w:hyperlink>
       <w:r>
+        <w:t xml:space="preserve">,</w:t>
+      </w:r>
+      <w:r>
+        <w:t xml:space="preserve"> </w:t>
+      </w:r>
+      <w:hyperlink w:anchor="ref-wang2024continual">
+        <w:r>
+          <w:rPr>
+            <w:rStyle w:val="Hyperlink"/>
+          </w:rPr>
+          <w:t xml:space="preserve">[25]</w:t>
+        </w:r>
+      </w:hyperlink>
+      <w:r>
         <w:t xml:space="preserve">; the connection to meta-learning, where a distribution shift becomes a change of task distribution, is the one this paper exploits.</w:t>
       </w:r>
     </w:p>
@@ -1677,7 +1694,7 @@
           <w:rPr>
             <w:rStyle w:val="Hyperlink"/>
           </w:rPr>
-          <w:t xml:space="preserve">[25]</w:t>
+          <w:t xml:space="preserve">[26]</w:t>
         </w:r>
       </w:hyperlink>
       <w:r>
@@ -2571,7 +2588,7 @@
           <w:rPr>
             <w:rStyle w:val="Hyperlink"/>
           </w:rPr>
-          <w:t xml:space="preserve">[26]</w:t>
+          <w:t xml:space="preserve">[27]</w:t>
         </w:r>
       </w:hyperlink>
       <w:r>
@@ -2653,20 +2670,6 @@
         <w:t xml:space="preserve"> </w:t>
       </w:r>
       <w:hyperlink w:anchor="ref-goh2016swat">
-        <w:r>
-          <w:rPr>
-            <w:rStyle w:val="Hyperlink"/>
-          </w:rPr>
-          <w:t xml:space="preserve">[27]</w:t>
-        </w:r>
-      </w:hyperlink>
-      <w:r>
-        <w:t xml:space="preserve">, WADI</w:t>
-      </w:r>
-      <w:r>
-        <w:t xml:space="preserve"> </w:t>
-      </w:r>
-      <w:hyperlink w:anchor="ref-ahmed2017wadi">
         <w:r>
           <w:rPr>
             <w:rStyle w:val="Hyperlink"/>
@@ -2675,12 +2678,12 @@
         </w:r>
       </w:hyperlink>
       <w:r>
-        <w:t xml:space="preserve">, HAI</w:t>
-      </w:r>
-      <w:r>
-        <w:t xml:space="preserve"> </w:t>
-      </w:r>
-      <w:hyperlink w:anchor="ref-shin2021hai">
+        <w:t xml:space="preserve">, WADI</w:t>
+      </w:r>
+      <w:r>
+        <w:t xml:space="preserve"> </w:t>
+      </w:r>
+      <w:hyperlink w:anchor="ref-ahmed2017wadi">
         <w:r>
           <w:rPr>
             <w:rStyle w:val="Hyperlink"/>
@@ -2689,6 +2692,20 @@
         </w:r>
       </w:hyperlink>
       <w:r>
+        <w:t xml:space="preserve">, HAI</w:t>
+      </w:r>
+      <w:r>
+        <w:t xml:space="preserve"> </w:t>
+      </w:r>
+      <w:hyperlink w:anchor="ref-shin2021hai">
+        <w:r>
+          <w:rPr>
+            <w:rStyle w:val="Hyperlink"/>
+          </w:rPr>
+          <w:t xml:space="preserve">[30]</w:t>
+        </w:r>
+      </w:hyperlink>
+      <w:r>
         <w:t xml:space="preserve">, SMAP/MSL</w:t>
       </w:r>
       <w:r>
@@ -2699,7 +2716,7 @@
           <w:rPr>
             <w:rStyle w:val="Hyperlink"/>
           </w:rPr>
-          <w:t xml:space="preserve">[30]</w:t>
+          <w:t xml:space="preserve">[31]</w:t>
         </w:r>
       </w:hyperlink>
       <w:r>
@@ -2998,7 +3015,7 @@
             <w:r>
               <w:t xml:space="preserve"> </w:t>
             </w:r>
-            <w:hyperlink w:anchor="ref-feng2025metauad">
+            <w:hyperlink w:anchor="ref-feng2024metauad">
               <w:r>
                 <w:rPr>
                   <w:rStyle w:val="Hyperlink"/>
@@ -3016,7 +3033,7 @@
               <w:jc w:val="left"/>
             </w:pPr>
             <w:r>
-              <w:t xml:space="preserve">2025</w:t>
+              <w:t xml:space="preserve">2024</w:t>
             </w:r>
           </w:p>
         </w:tc>
@@ -3258,7 +3275,7 @@
                 <w:rPr>
                   <w:rStyle w:val="Hyperlink"/>
                 </w:rPr>
-                <w:t xml:space="preserve">[31]</w:t>
+                <w:t xml:space="preserve">[32]</w:t>
               </w:r>
             </w:hyperlink>
           </w:p>
@@ -3428,7 +3445,7 @@
                 <w:rPr>
                   <w:rStyle w:val="Hyperlink"/>
                 </w:rPr>
-                <w:t xml:space="preserve">[26]</w:t>
+                <w:t xml:space="preserve">[27]</w:t>
               </w:r>
             </w:hyperlink>
           </w:p>
@@ -3503,17 +3520,17 @@
               <w:jc w:val="left"/>
             </w:pPr>
             <w:r>
-              <w:t xml:space="preserve">Wang et al.</w:t>
+              <w:t xml:space="preserve">Yan et al.</w:t>
             </w:r>
             <w:r>
               <w:t xml:space="preserve"> </w:t>
             </w:r>
-            <w:hyperlink w:anchor="ref-wang2024fewshot">
+            <w:hyperlink w:anchor="ref-yan2024fewshot">
               <w:r>
                 <w:rPr>
                   <w:rStyle w:val="Hyperlink"/>
                 </w:rPr>
-                <w:t xml:space="preserve">[32]</w:t>
+                <w:t xml:space="preserve">[33]</w:t>
               </w:r>
             </w:hyperlink>
           </w:p>
@@ -3775,7 +3792,7 @@
       <w:r>
         <w:t xml:space="preserve"> </w:t>
       </w:r>
-      <w:hyperlink w:anchor="ref-feng2025metauad">
+      <w:hyperlink w:anchor="ref-feng2024metauad">
         <w:r>
           <w:rPr>
             <w:rStyle w:val="Hyperlink"/>
@@ -3940,7 +3957,7 @@
           <w:rPr>
             <w:rStyle w:val="Hyperlink"/>
           </w:rPr>
-          <w:t xml:space="preserve">[22]</w:t>
+          <w:t xml:space="preserve">[23]</w:t>
         </w:r>
       </w:hyperlink>
       <w:r>
@@ -4011,20 +4028,6 @@
         <w:t xml:space="preserve"> </w:t>
       </w:r>
       <w:hyperlink w:anchor="ref-kim2022rigorous">
-        <w:r>
-          <w:rPr>
-            <w:rStyle w:val="Hyperlink"/>
-          </w:rPr>
-          <w:t xml:space="preserve">[33]</w:t>
-        </w:r>
-      </w:hyperlink>
-      <w:r>
-        <w:t xml:space="preserve">,</w:t>
-      </w:r>
-      <w:r>
-        <w:t xml:space="preserve"> </w:t>
-      </w:r>
-      <w:hyperlink w:anchor="ref-garg2022evaluation">
         <w:r>
           <w:rPr>
             <w:rStyle w:val="Hyperlink"/>
@@ -4038,12 +4041,26 @@
       <w:r>
         <w:t xml:space="preserve"> </w:t>
       </w:r>
+      <w:hyperlink w:anchor="ref-garg2022evaluation">
+        <w:r>
+          <w:rPr>
+            <w:rStyle w:val="Hyperlink"/>
+          </w:rPr>
+          <w:t xml:space="preserve">[35]</w:t>
+        </w:r>
+      </w:hyperlink>
+      <w:r>
+        <w:t xml:space="preserve">,</w:t>
+      </w:r>
+      <w:r>
+        <w:t xml:space="preserve"> </w:t>
+      </w:r>
       <w:hyperlink w:anchor="ref-wu2023flawed">
         <w:r>
           <w:rPr>
             <w:rStyle w:val="Hyperlink"/>
           </w:rPr>
-          <w:t xml:space="preserve">[35]</w:t>
+          <w:t xml:space="preserve">[36]</w:t>
         </w:r>
       </w:hyperlink>
       <w:r>
@@ -4303,7 +4320,7 @@
                 <w:rPr>
                   <w:rStyle w:val="Hyperlink"/>
                 </w:rPr>
-                <w:t xml:space="preserve">[36]</w:t>
+                <w:t xml:space="preserve">[37]</w:t>
               </w:r>
             </w:hyperlink>
             <w:r>
@@ -4798,7 +4815,7 @@
           <w:rPr>
             <w:rStyle w:val="Hyperlink"/>
           </w:rPr>
-          <w:t xml:space="preserve">[18]</w:t>
+          <w:t xml:space="preserve">[19]</w:t>
         </w:r>
       </w:hyperlink>
       <w:r>
@@ -4841,7 +4858,7 @@
           <w:rPr>
             <w:rStyle w:val="Hyperlink"/>
           </w:rPr>
-          <w:t xml:space="preserve">[19]</w:t>
+          <w:t xml:space="preserve">[20]</w:t>
         </w:r>
       </w:hyperlink>
       <w:r>
@@ -4881,7 +4898,7 @@
           <w:rPr>
             <w:rStyle w:val="Hyperlink"/>
           </w:rPr>
-          <w:t xml:space="preserve">[36]</w:t>
+          <w:t xml:space="preserve">[37]</w:t>
         </w:r>
       </w:hyperlink>
       <w:r>
@@ -5016,7 +5033,7 @@
           <w:rPr>
             <w:rStyle w:val="Hyperlink"/>
           </w:rPr>
-          <w:t xml:space="preserve">[23]</w:t>
+          <w:t xml:space="preserve">[24]</w:t>
         </w:r>
       </w:hyperlink>
       <w:r>
@@ -5079,7 +5096,7 @@
           <w:rPr>
             <w:rStyle w:val="Hyperlink"/>
           </w:rPr>
-          <w:t xml:space="preserve">[37]</w:t>
+          <w:t xml:space="preserve">[38]</w:t>
         </w:r>
       </w:hyperlink>
       <w:r>
@@ -5211,7 +5228,7 @@
           <w:rPr>
             <w:rStyle w:val="Hyperlink"/>
           </w:rPr>
-          <w:t xml:space="preserve">[29]</w:t>
+          <w:t xml:space="preserve">[30]</w:t>
         </w:r>
       </w:hyperlink>
       <w:r>
@@ -5234,33 +5251,6 @@
         <w:t xml:space="preserve"> </w:t>
       </w:r>
       <w:hyperlink w:anchor="ref-su2019omnianomaly">
-        <w:r>
-          <w:rPr>
-            <w:rStyle w:val="Hyperlink"/>
-          </w:rPr>
-          <w:t xml:space="preserve">[38]</w:t>
-        </w:r>
-      </w:hyperlink>
-      <w:r>
-        <w:t xml:space="preserve"> </w:t>
-      </w:r>
-      <w:r>
-        <w:t xml:space="preserve">has 28 server machines with 38 metrics at one-minute resolution; each machine is an entity, and 30 % of the machines are held out per seed.</w:t>
-      </w:r>
-      <w:r>
-        <w:t xml:space="preserve"> </w:t>
-      </w:r>
-      <w:r>
-        <w:rPr>
-          <w:iCs/>
-          <w:i/>
-        </w:rPr>
-        <w:t xml:space="preserve">SKAB</w:t>
-      </w:r>
-      <w:r>
-        <w:t xml:space="preserve"> </w:t>
-      </w:r>
-      <w:hyperlink w:anchor="ref-katser2020skab">
         <w:r>
           <w:rPr>
             <w:rStyle w:val="Hyperlink"/>
@@ -5272,6 +5262,33 @@
         <w:t xml:space="preserve"> </w:t>
       </w:r>
       <w:r>
+        <w:t xml:space="preserve">has 28 server machines with 38 metrics at one-minute resolution; each machine is an entity, and 30 % of the machines are held out per seed.</w:t>
+      </w:r>
+      <w:r>
+        <w:t xml:space="preserve"> </w:t>
+      </w:r>
+      <w:r>
+        <w:rPr>
+          <w:iCs/>
+          <w:i/>
+        </w:rPr>
+        <w:t xml:space="preserve">SKAB</w:t>
+      </w:r>
+      <w:r>
+        <w:t xml:space="preserve"> </w:t>
+      </w:r>
+      <w:hyperlink w:anchor="ref-katser2020skab">
+        <w:r>
+          <w:rPr>
+            <w:rStyle w:val="Hyperlink"/>
+          </w:rPr>
+          <w:t xml:space="preserve">[40]</w:t>
+        </w:r>
+      </w:hyperlink>
+      <w:r>
+        <w:t xml:space="preserve"> </w:t>
+      </w:r>
+      <w:r>
         <w:t xml:space="preserve">is a water-circulation rig with 8 sensors at 1 Hz and 34 short runs in which a valve or the pump is manipulated. The anomaly-free recording sits at a very different flow level from most runs, so each run is standardised with its own normal prefix, which becomes its training stream; one run with almost no prefix is dropped, and 30 % of runs are held out per seed. This makes SKAB a genuine few-shot setting: the detector meets a new run with a few hundred seconds of normal operation.</w:t>
       </w:r>
       <w:r>
@@ -5292,7 +5309,7 @@
           <w:rPr>
             <w:rStyle w:val="Hyperlink"/>
           </w:rPr>
-          <w:t xml:space="preserve">[40]</w:t>
+          <w:t xml:space="preserve">[41]</w:t>
         </w:r>
       </w:hyperlink>
       <w:r>
@@ -16101,7 +16118,7 @@
       </w:r>
     </w:p>
     <w:bookmarkEnd w:id="83"/>
-    <w:bookmarkStart w:id="134" w:name="declaration"/>
+    <w:bookmarkStart w:id="147" w:name="declaration"/>
     <w:p>
       <w:pPr>
         <w:pStyle w:val="Heading1"/>
@@ -16118,7 +16135,7 @@
         <w:t xml:space="preserve">The authors declare no competing interests. This research received no specific grant.</w:t>
       </w:r>
     </w:p>
-    <w:bookmarkStart w:id="133" w:name="refs"/>
+    <w:bookmarkStart w:id="146" w:name="refs"/>
     <w:bookmarkStart w:id="85" w:name="ref-chandola2009survey"/>
     <w:p>
       <w:pPr>
@@ -16276,7 +16293,7 @@
       </w:r>
     </w:p>
     <w:bookmarkEnd w:id="88"/>
-    <w:bookmarkStart w:id="89" w:name="ref-audibert2020usad"/>
+    <w:bookmarkStart w:id="90" w:name="ref-audibert2020usad"/>
     <w:p>
       <w:pPr>
         <w:pStyle w:val="Bibliography"/>
@@ -16322,11 +16339,25 @@
         <w:t xml:space="preserve">Proceedings of the 26th ACM SIGKDD international conference on knowledge discovery &amp; data mining</w:t>
       </w:r>
       <w:r>
-        <w:t xml:space="preserve">, 2020, pp. 3395–3404.</w:t>
-      </w:r>
-    </w:p>
-    <w:bookmarkEnd w:id="89"/>
-    <w:bookmarkStart w:id="90" w:name="ref-gama2014drift"/>
+        <w:t xml:space="preserve">, 2020, pp. 3395–3404. doi:</w:t>
+      </w:r>
+      <w:r>
+        <w:t xml:space="preserve"> </w:t>
+      </w:r>
+      <w:hyperlink r:id="rId89">
+        <w:r>
+          <w:rPr>
+            <w:rStyle w:val="Hyperlink"/>
+          </w:rPr>
+          <w:t xml:space="preserve">10.1145/3394486.3403392</w:t>
+        </w:r>
+      </w:hyperlink>
+      <w:r>
+        <w:t xml:space="preserve">.</w:t>
+      </w:r>
+    </w:p>
+    <w:bookmarkEnd w:id="90"/>
+    <w:bookmarkStart w:id="91" w:name="ref-gama2014drift"/>
     <w:p>
       <w:pPr>
         <w:pStyle w:val="Bibliography"/>
@@ -16363,8 +16394,8 @@
         <w:t xml:space="preserve">, vol. 46, no. 4, pp. 44:1–44:37, 2014.</w:t>
       </w:r>
     </w:p>
-    <w:bookmarkEnd w:id="90"/>
-    <w:bookmarkStart w:id="91" w:name="ref-lu2019drift"/>
+    <w:bookmarkEnd w:id="91"/>
+    <w:bookmarkStart w:id="93" w:name="ref-lu2019drift"/>
     <w:p>
       <w:pPr>
         <w:pStyle w:val="Bibliography"/>
@@ -16398,11 +16429,25 @@
         <w:t xml:space="preserve">IEEE Transactions on Knowledge and Data Engineering</w:t>
       </w:r>
       <w:r>
-        <w:t xml:space="preserve">, vol. 31, no. 12, pp. 2346–2363, 2019.</w:t>
-      </w:r>
-    </w:p>
-    <w:bookmarkEnd w:id="91"/>
-    <w:bookmarkStart w:id="92" w:name="ref-finn2017maml"/>
+        <w:t xml:space="preserve">, vol. 31, no. 12, pp. 2346–2363, 2019, doi:</w:t>
+      </w:r>
+      <w:r>
+        <w:t xml:space="preserve"> </w:t>
+      </w:r>
+      <w:hyperlink r:id="rId92">
+        <w:r>
+          <w:rPr>
+            <w:rStyle w:val="Hyperlink"/>
+          </w:rPr>
+          <w:t xml:space="preserve">10.1109/TKDE.2018.2876857</w:t>
+        </w:r>
+      </w:hyperlink>
+      <w:r>
+        <w:t xml:space="preserve">.</w:t>
+      </w:r>
+    </w:p>
+    <w:bookmarkEnd w:id="93"/>
+    <w:bookmarkStart w:id="94" w:name="ref-finn2017maml"/>
     <w:p>
       <w:pPr>
         <w:pStyle w:val="Bibliography"/>
@@ -16445,8 +16490,8 @@
         <w:t xml:space="preserve">, in PMLR, vol. 70. 2017, pp. 1126–1135.</w:t>
       </w:r>
     </w:p>
-    <w:bookmarkEnd w:id="92"/>
-    <w:bookmarkStart w:id="93" w:name="ref-snell2017proto"/>
+    <w:bookmarkEnd w:id="94"/>
+    <w:bookmarkStart w:id="95" w:name="ref-snell2017proto"/>
     <w:p>
       <w:pPr>
         <w:pStyle w:val="Bibliography"/>
@@ -16489,8 +16534,8 @@
         <w:t xml:space="preserve">, 2017, pp. 4077–4087.</w:t>
       </w:r>
     </w:p>
-    <w:bookmarkEnd w:id="93"/>
-    <w:bookmarkStart w:id="94" w:name="ref-hospedales2022meta"/>
+    <w:bookmarkEnd w:id="95"/>
+    <w:bookmarkStart w:id="96" w:name="ref-hospedales2022meta"/>
     <w:p>
       <w:pPr>
         <w:pStyle w:val="Bibliography"/>
@@ -16527,8 +16572,8 @@
         <w:t xml:space="preserve">, vol. 44, no. 9, pp. 5149–5169, 2022.</w:t>
       </w:r>
     </w:p>
-    <w:bookmarkEnd w:id="94"/>
-    <w:bookmarkStart w:id="96" w:name="ref-moon2023mavae"/>
+    <w:bookmarkEnd w:id="96"/>
+    <w:bookmarkStart w:id="98" w:name="ref-moon2023mavae"/>
     <w:p>
       <w:pPr>
         <w:pStyle w:val="Bibliography"/>
@@ -16543,7 +16588,7 @@
         <w:t xml:space="preserve">	</w:t>
       </w:r>
       <w:r>
-        <w:t xml:space="preserve">J. Moon, Y. Noh, S. Jung, J. Lee, and J. Hwang,</w:t>
+        <w:t xml:space="preserve">J. Moon, Y. Noh, S. Jung, J. Lee, and E. Hwang,</w:t>
       </w:r>
       <w:r>
         <w:t xml:space="preserve"> </w:t>
@@ -16567,7 +16612,7 @@
       <w:r>
         <w:t xml:space="preserve"> </w:t>
       </w:r>
-      <w:hyperlink r:id="rId95">
+      <w:hyperlink r:id="rId97">
         <w:r>
           <w:rPr>
             <w:rStyle w:val="Hyperlink"/>
@@ -16579,8 +16624,8 @@
         <w:t xml:space="preserve">.</w:t>
       </w:r>
     </w:p>
-    <w:bookmarkEnd w:id="96"/>
-    <w:bookmarkStart w:id="97" w:name="ref-feng2025metauad"/>
+    <w:bookmarkEnd w:id="98"/>
+    <w:bookmarkStart w:id="99" w:name="ref-feng2024metauad"/>
     <w:p>
       <w:pPr>
         <w:pStyle w:val="Bibliography"/>
@@ -16607,30 +16652,17 @@
         <w:t xml:space="preserve">Meta-UAD</w:t>
       </w:r>
       <w:r>
-        <w:t xml:space="preserve">: A meta-learning scheme for user-level network traffic anomaly detection,”</w:t>
-      </w:r>
-      <w:r>
-        <w:t xml:space="preserve"> </w:t>
-      </w:r>
-      <w:r>
-        <w:t xml:space="preserve">in</w:t>
-      </w:r>
-      <w:r>
-        <w:t xml:space="preserve"> </w:t>
-      </w:r>
-      <w:r>
-        <w:rPr>
-          <w:iCs/>
-          <w:i/>
-        </w:rPr>
-        <w:t xml:space="preserve">2025 IEEE international conference on acoustics, speech and signal processing (ICASSP)</w:t>
-      </w:r>
-      <w:r>
-        <w:t xml:space="preserve">, 2025.</w:t>
-      </w:r>
-    </w:p>
-    <w:bookmarkEnd w:id="97"/>
-    <w:bookmarkStart w:id="98" w:name="ref-tian2024omlog"/>
+        <w:t xml:space="preserve">: A meta-learning scheme for user-level network traffic anomaly detection.”</w:t>
+      </w:r>
+      <w:r>
+        <w:t xml:space="preserve"> </w:t>
+      </w:r>
+      <w:r>
+        <w:t xml:space="preserve">2024.</w:t>
+      </w:r>
+    </w:p>
+    <w:bookmarkEnd w:id="99"/>
+    <w:bookmarkStart w:id="100" w:name="ref-tian2024omlog"/>
     <w:p>
       <w:pPr>
         <w:pStyle w:val="Bibliography"/>
@@ -16666,8 +16698,8 @@
         <w:t xml:space="preserve">2024.</w:t>
       </w:r>
     </w:p>
-    <w:bookmarkEnd w:id="98"/>
-    <w:bookmarkStart w:id="100" w:name="ref-kermenov2023drift"/>
+    <w:bookmarkEnd w:id="100"/>
+    <w:bookmarkStart w:id="102" w:name="ref-kermenov2023drift"/>
     <w:p>
       <w:pPr>
         <w:pStyle w:val="Bibliography"/>
@@ -16706,7 +16738,7 @@
       <w:r>
         <w:t xml:space="preserve"> </w:t>
       </w:r>
-      <w:hyperlink r:id="rId99">
+      <w:hyperlink r:id="rId101">
         <w:r>
           <w:rPr>
             <w:rStyle w:val="Hyperlink"/>
@@ -16718,8 +16750,8 @@
         <w:t xml:space="preserve">.</w:t>
       </w:r>
     </w:p>
-    <w:bookmarkEnd w:id="100"/>
-    <w:bookmarkStart w:id="102" w:name="ref-wahab2022online"/>
+    <w:bookmarkEnd w:id="102"/>
+    <w:bookmarkStart w:id="104" w:name="ref-wahab2022online"/>
     <w:p>
       <w:pPr>
         <w:pStyle w:val="Bibliography"/>
@@ -16770,7 +16802,7 @@
       <w:r>
         <w:t xml:space="preserve"> </w:t>
       </w:r>
-      <w:hyperlink r:id="rId101">
+      <w:hyperlink r:id="rId103">
         <w:r>
           <w:rPr>
             <w:rStyle w:val="Hyperlink"/>
@@ -16782,8 +16814,8 @@
         <w:t xml:space="preserve">.</w:t>
       </w:r>
     </w:p>
-    <w:bookmarkEnd w:id="102"/>
-    <w:bookmarkStart w:id="103" w:name="ref-antoniou2019mamlpp"/>
+    <w:bookmarkEnd w:id="104"/>
+    <w:bookmarkStart w:id="105" w:name="ref-antoniou2019mamlpp"/>
     <w:p>
       <w:pPr>
         <w:pStyle w:val="Bibliography"/>
@@ -16835,8 +16867,8 @@
         <w:t xml:space="preserve">, 2019.</w:t>
       </w:r>
     </w:p>
-    <w:bookmarkEnd w:id="103"/>
-    <w:bookmarkStart w:id="104" w:name="ref-li2017metasgd"/>
+    <w:bookmarkEnd w:id="105"/>
+    <w:bookmarkStart w:id="106" w:name="ref-li2017metasgd"/>
     <w:p>
       <w:pPr>
         <w:pStyle w:val="Bibliography"/>
@@ -16872,8 +16904,8 @@
         <w:t xml:space="preserve">2017.</w:t>
       </w:r>
     </w:p>
-    <w:bookmarkEnd w:id="104"/>
-    <w:bookmarkStart w:id="105" w:name="ref-nichol2018fomaml"/>
+    <w:bookmarkEnd w:id="106"/>
+    <w:bookmarkStart w:id="107" w:name="ref-nichol2018fomaml"/>
     <w:p>
       <w:pPr>
         <w:pStyle w:val="Bibliography"/>
@@ -16903,14 +16935,72 @@
         <w:t xml:space="preserve">2018.</w:t>
       </w:r>
     </w:p>
-    <w:bookmarkEnd w:id="105"/>
-    <w:bookmarkStart w:id="106" w:name="ref-bifet2007adwin"/>
+    <w:bookmarkEnd w:id="107"/>
+    <w:bookmarkStart w:id="109" w:name="ref-gama2004ddm"/>
     <w:p>
       <w:pPr>
         <w:pStyle w:val="Bibliography"/>
       </w:pPr>
       <w:r>
         <w:t xml:space="preserve">[18]</w:t>
+      </w:r>
+      <w:r>
+        <w:t xml:space="preserve"> </w:t>
+      </w:r>
+      <w:r>
+        <w:t xml:space="preserve">	</w:t>
+      </w:r>
+      <w:r>
+        <w:t xml:space="preserve">J. Gama, P. Medas, G. Castillo, and P. Rodrigues,</w:t>
+      </w:r>
+      <w:r>
+        <w:t xml:space="preserve"> </w:t>
+      </w:r>
+      <w:r>
+        <w:t xml:space="preserve">“Learning with drift detection,”</w:t>
+      </w:r>
+      <w:r>
+        <w:t xml:space="preserve"> </w:t>
+      </w:r>
+      <w:r>
+        <w:t xml:space="preserve">in</w:t>
+      </w:r>
+      <w:r>
+        <w:t xml:space="preserve"> </w:t>
+      </w:r>
+      <w:r>
+        <w:rPr>
+          <w:iCs/>
+          <w:i/>
+        </w:rPr>
+        <w:t xml:space="preserve">Advances in artificial intelligence – SBIA 2004</w:t>
+      </w:r>
+      <w:r>
+        <w:t xml:space="preserve">, in Lecture notes in computer science, vol. 3171. Springer, 2004, pp. 286–295. doi:</w:t>
+      </w:r>
+      <w:r>
+        <w:t xml:space="preserve"> </w:t>
+      </w:r>
+      <w:hyperlink r:id="rId108">
+        <w:r>
+          <w:rPr>
+            <w:rStyle w:val="Hyperlink"/>
+          </w:rPr>
+          <w:t xml:space="preserve">10.1007/978-3-540-28645-5_29</w:t>
+        </w:r>
+      </w:hyperlink>
+      <w:r>
+        <w:t xml:space="preserve">.</w:t>
+      </w:r>
+    </w:p>
+    <w:bookmarkEnd w:id="109"/>
+    <w:bookmarkStart w:id="111" w:name="ref-bifet2007adwin"/>
+    <w:p>
+      <w:pPr>
+        <w:pStyle w:val="Bibliography"/>
+      </w:pPr>
+      <w:r>
+        <w:t xml:space="preserve">[19]</w:t>
       </w:r>
       <w:r>
         <w:t xml:space="preserve"> </w:t>
@@ -16944,17 +17034,31 @@
         <w:t xml:space="preserve">Proceedings of the 2007 SIAM international conference on data mining</w:t>
       </w:r>
       <w:r>
-        <w:t xml:space="preserve">, 2007, pp. 443–448.</w:t>
-      </w:r>
-    </w:p>
-    <w:bookmarkEnd w:id="106"/>
-    <w:bookmarkStart w:id="107" w:name="ref-gretton2012mmd"/>
+        <w:t xml:space="preserve">, 2007, pp. 443–448. doi:</w:t>
+      </w:r>
+      <w:r>
+        <w:t xml:space="preserve"> </w:t>
+      </w:r>
+      <w:hyperlink r:id="rId110">
+        <w:r>
+          <w:rPr>
+            <w:rStyle w:val="Hyperlink"/>
+          </w:rPr>
+          <w:t xml:space="preserve">10.1137/1.9781611972771.42</w:t>
+        </w:r>
+      </w:hyperlink>
+      <w:r>
+        <w:t xml:space="preserve">.</w:t>
+      </w:r>
+    </w:p>
+    <w:bookmarkEnd w:id="111"/>
+    <w:bookmarkStart w:id="112" w:name="ref-gretton2012mmd"/>
     <w:p>
       <w:pPr>
         <w:pStyle w:val="Bibliography"/>
       </w:pPr>
       <w:r>
-        <w:t xml:space="preserve">[19]</w:t>
+        <w:t xml:space="preserve">[20]</w:t>
       </w:r>
       <w:r>
         <w:t xml:space="preserve"> </w:t>
@@ -16985,14 +17089,14 @@
         <w:t xml:space="preserve">, vol. 13, pp. 723–773, 2012.</w:t>
       </w:r>
     </w:p>
-    <w:bookmarkEnd w:id="107"/>
-    <w:bookmarkStart w:id="108" w:name="ref-hinder2024a"/>
+    <w:bookmarkEnd w:id="112"/>
+    <w:bookmarkStart w:id="114" w:name="ref-hinder2024a"/>
     <w:p>
       <w:pPr>
         <w:pStyle w:val="Bibliography"/>
       </w:pPr>
       <w:r>
-        <w:t xml:space="preserve">[20]</w:t>
+        <w:t xml:space="preserve">[21]</w:t>
       </w:r>
       <w:r>
         <w:t xml:space="preserve"> </w:t>
@@ -17038,17 +17142,31 @@
         <w:t xml:space="preserve">Frontiers in Artificial Intelligence</w:t>
       </w:r>
       <w:r>
-        <w:t xml:space="preserve">, vol. 7, p. 1330257, 2024.</w:t>
-      </w:r>
-    </w:p>
-    <w:bookmarkEnd w:id="108"/>
-    <w:bookmarkStart w:id="109" w:name="ref-hinder2024b"/>
+        <w:t xml:space="preserve">, vol. 7, p. 1330257, 2024, doi:</w:t>
+      </w:r>
+      <w:r>
+        <w:t xml:space="preserve"> </w:t>
+      </w:r>
+      <w:hyperlink r:id="rId113">
+        <w:r>
+          <w:rPr>
+            <w:rStyle w:val="Hyperlink"/>
+          </w:rPr>
+          <w:t xml:space="preserve">10.3389/frai.2024.1330257</w:t>
+        </w:r>
+      </w:hyperlink>
+      <w:r>
+        <w:t xml:space="preserve">.</w:t>
+      </w:r>
+    </w:p>
+    <w:bookmarkEnd w:id="114"/>
+    <w:bookmarkStart w:id="116" w:name="ref-hinder2024b"/>
     <w:p>
       <w:pPr>
         <w:pStyle w:val="Bibliography"/>
       </w:pPr>
       <w:r>
-        <w:t xml:space="preserve">[21]</w:t>
+        <w:t xml:space="preserve">[22]</w:t>
       </w:r>
       <w:r>
         <w:t xml:space="preserve"> </w:t>
@@ -17081,7 +17199,7 @@
         <w:t xml:space="preserve">B</w:t>
       </w:r>
       <w:r>
-        <w:t xml:space="preserve">: Adapting to concept drift,”</w:t>
+        <w:t xml:space="preserve">: Locating and explaining concept drift,”</w:t>
       </w:r>
       <w:r>
         <w:t xml:space="preserve"> </w:t>
@@ -17094,17 +17212,31 @@
         <w:t xml:space="preserve">Frontiers in Artificial Intelligence</w:t>
       </w:r>
       <w:r>
-        <w:t xml:space="preserve">, vol. 7, p. 1338265, 2024.</w:t>
-      </w:r>
-    </w:p>
-    <w:bookmarkEnd w:id="109"/>
-    <w:bookmarkStart w:id="110" w:name="ref-kirkpatrick2017ewc"/>
+        <w:t xml:space="preserve">, vol. 7, p. 1330258, 2024, doi:</w:t>
+      </w:r>
+      <w:r>
+        <w:t xml:space="preserve"> </w:t>
+      </w:r>
+      <w:hyperlink r:id="rId115">
+        <w:r>
+          <w:rPr>
+            <w:rStyle w:val="Hyperlink"/>
+          </w:rPr>
+          <w:t xml:space="preserve">10.3389/frai.2024.1330258</w:t>
+        </w:r>
+      </w:hyperlink>
+      <w:r>
+        <w:t xml:space="preserve">.</w:t>
+      </w:r>
+    </w:p>
+    <w:bookmarkEnd w:id="116"/>
+    <w:bookmarkStart w:id="117" w:name="ref-kirkpatrick2017ewc"/>
     <w:p>
       <w:pPr>
         <w:pStyle w:val="Bibliography"/>
       </w:pPr>
       <w:r>
-        <w:t xml:space="preserve">[22]</w:t>
+        <w:t xml:space="preserve">[23]</w:t>
       </w:r>
       <w:r>
         <w:t xml:space="preserve"> </w:t>
@@ -17148,14 +17280,14 @@
         <w:t xml:space="preserve">, vol. 114, no. 13, pp. 3521–3526, 2017.</w:t>
       </w:r>
     </w:p>
-    <w:bookmarkEnd w:id="110"/>
-    <w:bookmarkStart w:id="111" w:name="ref-rolnick2019replay"/>
+    <w:bookmarkEnd w:id="117"/>
+    <w:bookmarkStart w:id="118" w:name="ref-rolnick2019replay"/>
     <w:p>
       <w:pPr>
         <w:pStyle w:val="Bibliography"/>
       </w:pPr>
       <w:r>
-        <w:t xml:space="preserve">[23]</w:t>
+        <w:t xml:space="preserve">[24]</w:t>
       </w:r>
       <w:r>
         <w:t xml:space="preserve"> </w:t>
@@ -17192,14 +17324,14 @@
         <w:t xml:space="preserve">, 2019.</w:t>
       </w:r>
     </w:p>
-    <w:bookmarkEnd w:id="111"/>
-    <w:bookmarkStart w:id="112" w:name="ref-wang2024continual"/>
+    <w:bookmarkEnd w:id="118"/>
+    <w:bookmarkStart w:id="119" w:name="ref-wang2024continual"/>
     <w:p>
       <w:pPr>
         <w:pStyle w:val="Bibliography"/>
       </w:pPr>
       <w:r>
-        <w:t xml:space="preserve">[24]</w:t>
+        <w:t xml:space="preserve">[25]</w:t>
       </w:r>
       <w:r>
         <w:t xml:space="preserve"> </w:t>
@@ -17230,14 +17362,14 @@
         <w:t xml:space="preserve">, vol. 46, no. 8, pp. 5362–5383, 2024.</w:t>
       </w:r>
     </w:p>
-    <w:bookmarkEnd w:id="112"/>
-    <w:bookmarkStart w:id="113" w:name="ref-page2021prisma"/>
+    <w:bookmarkEnd w:id="119"/>
+    <w:bookmarkStart w:id="120" w:name="ref-page2021prisma"/>
     <w:p>
       <w:pPr>
         <w:pStyle w:val="Bibliography"/>
       </w:pPr>
       <w:r>
-        <w:t xml:space="preserve">[25]</w:t>
+        <w:t xml:space="preserve">[26]</w:t>
       </w:r>
       <w:r>
         <w:t xml:space="preserve"> </w:t>
@@ -17293,14 +17425,14 @@
         <w:t xml:space="preserve">, vol. 372, p. n71, 2021.</w:t>
       </w:r>
     </w:p>
-    <w:bookmarkEnd w:id="113"/>
-    <w:bookmarkStart w:id="115" w:name="ref-belay2023iot"/>
+    <w:bookmarkEnd w:id="120"/>
+    <w:bookmarkStart w:id="122" w:name="ref-belay2023iot"/>
     <w:p>
       <w:pPr>
         <w:pStyle w:val="Bibliography"/>
       </w:pPr>
       <w:r>
-        <w:t xml:space="preserve">[26]</w:t>
+        <w:t xml:space="preserve">[27]</w:t>
       </w:r>
       <w:r>
         <w:t xml:space="preserve"> </w:t>
@@ -17342,7 +17474,7 @@
       <w:r>
         <w:t xml:space="preserve"> </w:t>
       </w:r>
-      <w:hyperlink r:id="rId114">
+      <w:hyperlink r:id="rId121">
         <w:r>
           <w:rPr>
             <w:rStyle w:val="Hyperlink"/>
@@ -17354,14 +17486,14 @@
         <w:t xml:space="preserve">.</w:t>
       </w:r>
     </w:p>
-    <w:bookmarkEnd w:id="115"/>
-    <w:bookmarkStart w:id="116" w:name="ref-goh2016swat"/>
+    <w:bookmarkEnd w:id="122"/>
+    <w:bookmarkStart w:id="123" w:name="ref-goh2016swat"/>
     <w:p>
       <w:pPr>
         <w:pStyle w:val="Bibliography"/>
       </w:pPr>
       <w:r>
-        <w:t xml:space="preserve">[27]</w:t>
+        <w:t xml:space="preserve">[28]</w:t>
       </w:r>
       <w:r>
         <w:t xml:space="preserve"> </w:t>
@@ -17398,14 +17530,14 @@
         <w:t xml:space="preserve">, in Lecture notes in computer science, vol. 10242. Springer, 2017, pp. 88–99.</w:t>
       </w:r>
     </w:p>
-    <w:bookmarkEnd w:id="116"/>
-    <w:bookmarkStart w:id="117" w:name="ref-ahmed2017wadi"/>
+    <w:bookmarkEnd w:id="123"/>
+    <w:bookmarkStart w:id="124" w:name="ref-ahmed2017wadi"/>
     <w:p>
       <w:pPr>
         <w:pStyle w:val="Bibliography"/>
       </w:pPr>
       <w:r>
-        <w:t xml:space="preserve">[28]</w:t>
+        <w:t xml:space="preserve">[29]</w:t>
       </w:r>
       <w:r>
         <w:t xml:space="preserve"> </w:t>
@@ -17448,14 +17580,14 @@
         <w:t xml:space="preserve">, 2017, pp. 25–28.</w:t>
       </w:r>
     </w:p>
-    <w:bookmarkEnd w:id="117"/>
-    <w:bookmarkStart w:id="118" w:name="ref-shin2021hai"/>
+    <w:bookmarkEnd w:id="124"/>
+    <w:bookmarkStart w:id="125" w:name="ref-shin2021hai"/>
     <w:p>
       <w:pPr>
         <w:pStyle w:val="Bibliography"/>
       </w:pPr>
       <w:r>
-        <w:t xml:space="preserve">[29]</w:t>
+        <w:t xml:space="preserve">[30]</w:t>
       </w:r>
       <w:r>
         <w:t xml:space="preserve"> </w:t>
@@ -17525,14 +17657,14 @@
         <w:t xml:space="preserve">, 2021, pp. 36–40.</w:t>
       </w:r>
     </w:p>
-    <w:bookmarkEnd w:id="118"/>
-    <w:bookmarkStart w:id="119" w:name="ref-hundman2018smap"/>
+    <w:bookmarkEnd w:id="125"/>
+    <w:bookmarkStart w:id="127" w:name="ref-hundman2018smap"/>
     <w:p>
       <w:pPr>
         <w:pStyle w:val="Bibliography"/>
       </w:pPr>
       <w:r>
-        <w:t xml:space="preserve">[30]</w:t>
+        <w:t xml:space="preserve">[31]</w:t>
       </w:r>
       <w:r>
         <w:t xml:space="preserve"> </w:t>
@@ -17578,17 +17710,31 @@
         <w:t xml:space="preserve">Proceedings of the 24th ACM SIGKDD international conference on knowledge discovery &amp; data mining</w:t>
       </w:r>
       <w:r>
-        <w:t xml:space="preserve">, 2018, pp. 387–395.</w:t>
-      </w:r>
-    </w:p>
-    <w:bookmarkEnd w:id="119"/>
-    <w:bookmarkStart w:id="120" w:name="ref-zhang2023prn"/>
+        <w:t xml:space="preserve">, 2018, pp. 387–395. doi:</w:t>
+      </w:r>
+      <w:r>
+        <w:t xml:space="preserve"> </w:t>
+      </w:r>
+      <w:hyperlink r:id="rId126">
+        <w:r>
+          <w:rPr>
+            <w:rStyle w:val="Hyperlink"/>
+          </w:rPr>
+          <w:t xml:space="preserve">10.1145/3219819.3219845</w:t>
+        </w:r>
+      </w:hyperlink>
+      <w:r>
+        <w:t xml:space="preserve">.</w:t>
+      </w:r>
+    </w:p>
+    <w:bookmarkEnd w:id="127"/>
+    <w:bookmarkStart w:id="128" w:name="ref-zhang2023prn"/>
     <w:p>
       <w:pPr>
         <w:pStyle w:val="Bibliography"/>
       </w:pPr>
       <w:r>
-        <w:t xml:space="preserve">[31]</w:t>
+        <w:t xml:space="preserve">[32]</w:t>
       </w:r>
       <w:r>
         <w:t xml:space="preserve"> </w:t>
@@ -17625,14 +17771,14 @@
         <w:t xml:space="preserve">, 2023, pp. 16281–16291.</w:t>
       </w:r>
     </w:p>
-    <w:bookmarkEnd w:id="120"/>
-    <w:bookmarkStart w:id="122" w:name="ref-wang2024fewshot"/>
+    <w:bookmarkEnd w:id="128"/>
+    <w:bookmarkStart w:id="130" w:name="ref-yan2024fewshot"/>
     <w:p>
       <w:pPr>
         <w:pStyle w:val="Bibliography"/>
       </w:pPr>
       <w:r>
-        <w:t xml:space="preserve">[32]</w:t>
+        <w:t xml:space="preserve">[33]</w:t>
       </w:r>
       <w:r>
         <w:t xml:space="preserve"> </w:t>
@@ -17641,13 +17787,22 @@
         <w:t xml:space="preserve">	</w:t>
       </w:r>
       <w:r>
-        <w:t xml:space="preserve">Y. Wang, Z. Zhang, K. Zhao, P. Wang, and W. Wu,</w:t>
-      </w:r>
-      <w:r>
-        <w:t xml:space="preserve"> </w:t>
-      </w:r>
-      <w:r>
-        <w:t xml:space="preserve">“A few-shot learning based method for industrial internet intrusion detection,”</w:t>
+        <w:t xml:space="preserve">Y. Yan, Y. Yang, F. Shen, M. Gao, and Y. Gu,</w:t>
+      </w:r>
+      <w:r>
+        <w:t xml:space="preserve"> </w:t>
+      </w:r>
+      <w:r>
+        <w:t xml:space="preserve">“Meta learning-based few-shot intrusion detection for</w:t>
+      </w:r>
+      <w:r>
+        <w:t xml:space="preserve"> </w:t>
+      </w:r>
+      <w:r>
+        <w:t xml:space="preserve">5G</w:t>
+      </w:r>
+      <w:r>
+        <w:t xml:space="preserve">-enabled industrial internet,”</w:t>
       </w:r>
       <w:r>
         <w:t xml:space="preserve"> </w:t>
@@ -17657,34 +17812,34 @@
           <w:iCs/>
           <w:i/>
         </w:rPr>
-        <w:t xml:space="preserve">International Journal of Information Security</w:t>
-      </w:r>
-      <w:r>
-        <w:t xml:space="preserve">, vol. 23, no. 5, pp. 3241–3252, 2024, doi:</w:t>
-      </w:r>
-      <w:r>
-        <w:t xml:space="preserve"> </w:t>
-      </w:r>
-      <w:hyperlink r:id="rId121">
+        <w:t xml:space="preserve">Complex &amp; Intelligent Systems</w:t>
+      </w:r>
+      <w:r>
+        <w:t xml:space="preserve">, vol. 10, no. 3, pp. 4589–4608, 2024, doi:</w:t>
+      </w:r>
+      <w:r>
+        <w:t xml:space="preserve"> </w:t>
+      </w:r>
+      <w:hyperlink r:id="rId129">
         <w:r>
           <w:rPr>
             <w:rStyle w:val="Hyperlink"/>
           </w:rPr>
-          <w:t xml:space="preserve">10.1007/s10207-024-00889-x</w:t>
+          <w:t xml:space="preserve">10.1007/s40747-024-01388-1</w:t>
         </w:r>
       </w:hyperlink>
       <w:r>
         <w:t xml:space="preserve">.</w:t>
       </w:r>
     </w:p>
-    <w:bookmarkEnd w:id="122"/>
-    <w:bookmarkStart w:id="123" w:name="ref-kim2022rigorous"/>
+    <w:bookmarkEnd w:id="130"/>
+    <w:bookmarkStart w:id="132" w:name="ref-kim2022rigorous"/>
     <w:p>
       <w:pPr>
         <w:pStyle w:val="Bibliography"/>
       </w:pPr>
       <w:r>
-        <w:t xml:space="preserve">[33]</w:t>
+        <w:t xml:space="preserve">[34]</w:t>
       </w:r>
       <w:r>
         <w:t xml:space="preserve"> </w:t>
@@ -17718,17 +17873,31 @@
         <w:t xml:space="preserve">Proceedings of the AAAI conference on artificial intelligence</w:t>
       </w:r>
       <w:r>
-        <w:t xml:space="preserve">, 2022, pp. 7194–7201.</w:t>
-      </w:r>
-    </w:p>
-    <w:bookmarkEnd w:id="123"/>
-    <w:bookmarkStart w:id="124" w:name="ref-garg2022evaluation"/>
+        <w:t xml:space="preserve">, 2022, pp. 7194–7201. doi:</w:t>
+      </w:r>
+      <w:r>
+        <w:t xml:space="preserve"> </w:t>
+      </w:r>
+      <w:hyperlink r:id="rId131">
+        <w:r>
+          <w:rPr>
+            <w:rStyle w:val="Hyperlink"/>
+          </w:rPr>
+          <w:t xml:space="preserve">10.1609/aaai.v36i7.20680</w:t>
+        </w:r>
+      </w:hyperlink>
+      <w:r>
+        <w:t xml:space="preserve">.</w:t>
+      </w:r>
+    </w:p>
+    <w:bookmarkEnd w:id="132"/>
+    <w:bookmarkStart w:id="134" w:name="ref-garg2022evaluation"/>
     <w:p>
       <w:pPr>
         <w:pStyle w:val="Bibliography"/>
       </w:pPr>
       <w:r>
-        <w:t xml:space="preserve">[34]</w:t>
+        <w:t xml:space="preserve">[35]</w:t>
       </w:r>
       <w:r>
         <w:t xml:space="preserve"> </w:t>
@@ -17756,17 +17925,31 @@
         <w:t xml:space="preserve">IEEE Transactions on Neural Networks and Learning Systems</w:t>
       </w:r>
       <w:r>
-        <w:t xml:space="preserve">, vol. 33, no. 6, pp. 2508–2517, 2022.</w:t>
-      </w:r>
-    </w:p>
-    <w:bookmarkEnd w:id="124"/>
-    <w:bookmarkStart w:id="125" w:name="ref-wu2023flawed"/>
+        <w:t xml:space="preserve">, vol. 33, no. 6, pp. 2508–2517, 2022, doi:</w:t>
+      </w:r>
+      <w:r>
+        <w:t xml:space="preserve"> </w:t>
+      </w:r>
+      <w:hyperlink r:id="rId133">
+        <w:r>
+          <w:rPr>
+            <w:rStyle w:val="Hyperlink"/>
+          </w:rPr>
+          <w:t xml:space="preserve">10.1109/TNNLS.2021.3105827</w:t>
+        </w:r>
+      </w:hyperlink>
+      <w:r>
+        <w:t xml:space="preserve">.</w:t>
+      </w:r>
+    </w:p>
+    <w:bookmarkEnd w:id="134"/>
+    <w:bookmarkStart w:id="136" w:name="ref-wu2023flawed"/>
     <w:p>
       <w:pPr>
         <w:pStyle w:val="Bibliography"/>
       </w:pPr>
       <w:r>
-        <w:t xml:space="preserve">[35]</w:t>
+        <w:t xml:space="preserve">[36]</w:t>
       </w:r>
       <w:r>
         <w:t xml:space="preserve"> </w:t>
@@ -17794,17 +17977,31 @@
         <w:t xml:space="preserve">IEEE Transactions on Knowledge and Data Engineering</w:t>
       </w:r>
       <w:r>
-        <w:t xml:space="preserve">, vol. 35, no. 3, pp. 2421–2429, 2023.</w:t>
-      </w:r>
-    </w:p>
-    <w:bookmarkEnd w:id="125"/>
-    <w:bookmarkStart w:id="126" w:name="ref-siffer2017pot"/>
+        <w:t xml:space="preserve">, vol. 35, no. 3, pp. 2421–2429, 2023, doi:</w:t>
+      </w:r>
+      <w:r>
+        <w:t xml:space="preserve"> </w:t>
+      </w:r>
+      <w:hyperlink r:id="rId135">
+        <w:r>
+          <w:rPr>
+            <w:rStyle w:val="Hyperlink"/>
+          </w:rPr>
+          <w:t xml:space="preserve">10.1109/TKDE.2021.3112126</w:t>
+        </w:r>
+      </w:hyperlink>
+      <w:r>
+        <w:t xml:space="preserve">.</w:t>
+      </w:r>
+    </w:p>
+    <w:bookmarkEnd w:id="136"/>
+    <w:bookmarkStart w:id="137" w:name="ref-siffer2017pot"/>
     <w:p>
       <w:pPr>
         <w:pStyle w:val="Bibliography"/>
       </w:pPr>
       <w:r>
-        <w:t xml:space="preserve">[36]</w:t>
+        <w:t xml:space="preserve">[37]</w:t>
       </w:r>
       <w:r>
         <w:t xml:space="preserve"> </w:t>
@@ -17841,14 +18038,14 @@
         <w:t xml:space="preserve">, 2017, pp. 1067–1075.</w:t>
       </w:r>
     </w:p>
-    <w:bookmarkEnd w:id="126"/>
-    <w:bookmarkStart w:id="127" w:name="ref-bach2008paired"/>
+    <w:bookmarkEnd w:id="137"/>
+    <w:bookmarkStart w:id="138" w:name="ref-bach2008paired"/>
     <w:p>
       <w:pPr>
         <w:pStyle w:val="Bibliography"/>
       </w:pPr>
       <w:r>
-        <w:t xml:space="preserve">[37]</w:t>
+        <w:t xml:space="preserve">[38]</w:t>
       </w:r>
       <w:r>
         <w:t xml:space="preserve"> </w:t>
@@ -17885,14 +18082,14 @@
         <w:t xml:space="preserve">, 2008, pp. 23–32.</w:t>
       </w:r>
     </w:p>
-    <w:bookmarkEnd w:id="127"/>
-    <w:bookmarkStart w:id="128" w:name="ref-su2019omnianomaly"/>
+    <w:bookmarkEnd w:id="138"/>
+    <w:bookmarkStart w:id="140" w:name="ref-su2019omnianomaly"/>
     <w:p>
       <w:pPr>
         <w:pStyle w:val="Bibliography"/>
       </w:pPr>
       <w:r>
-        <w:t xml:space="preserve">[38]</w:t>
+        <w:t xml:space="preserve">[39]</w:t>
       </w:r>
       <w:r>
         <w:t xml:space="preserve"> </w:t>
@@ -17926,17 +18123,31 @@
         <w:t xml:space="preserve">Proceedings of the 25th ACM SIGKDD international conference on knowledge discovery &amp; data mining</w:t>
       </w:r>
       <w:r>
-        <w:t xml:space="preserve">, 2019, pp. 2828–2837.</w:t>
-      </w:r>
-    </w:p>
-    <w:bookmarkEnd w:id="128"/>
-    <w:bookmarkStart w:id="131" w:name="ref-katser2020skab"/>
+        <w:t xml:space="preserve">, 2019, pp. 2828–2837. doi:</w:t>
+      </w:r>
+      <w:r>
+        <w:t xml:space="preserve"> </w:t>
+      </w:r>
+      <w:hyperlink r:id="rId139">
+        <w:r>
+          <w:rPr>
+            <w:rStyle w:val="Hyperlink"/>
+          </w:rPr>
+          <w:t xml:space="preserve">10.1145/3292500.3330672</w:t>
+        </w:r>
+      </w:hyperlink>
+      <w:r>
+        <w:t xml:space="preserve">.</w:t>
+      </w:r>
+    </w:p>
+    <w:bookmarkEnd w:id="140"/>
+    <w:bookmarkStart w:id="143" w:name="ref-katser2020skab"/>
     <w:p>
       <w:pPr>
         <w:pStyle w:val="Bibliography"/>
       </w:pPr>
       <w:r>
-        <w:t xml:space="preserve">[39]</w:t>
+        <w:t xml:space="preserve">[40]</w:t>
       </w:r>
       <w:r>
         <w:t xml:space="preserve"> </w:t>
@@ -17962,7 +18173,7 @@
       <w:r>
         <w:t xml:space="preserve"> </w:t>
       </w:r>
-      <w:hyperlink r:id="rId129">
+      <w:hyperlink r:id="rId141">
         <w:r>
           <w:rPr>
             <w:rStyle w:val="Hyperlink"/>
@@ -17976,7 +18187,7 @@
       <w:r>
         <w:t xml:space="preserve"> </w:t>
       </w:r>
-      <w:hyperlink r:id="rId130">
+      <w:hyperlink r:id="rId142">
         <w:r>
           <w:rPr>
             <w:rStyle w:val="Hyperlink"/>
@@ -17988,14 +18199,14 @@
         <w:t xml:space="preserve">.</w:t>
       </w:r>
     </w:p>
-    <w:bookmarkEnd w:id="131"/>
-    <w:bookmarkStart w:id="132" w:name="ref-abdulaal2021psm"/>
+    <w:bookmarkEnd w:id="143"/>
+    <w:bookmarkStart w:id="145" w:name="ref-abdulaal2021psm"/>
     <w:p>
       <w:pPr>
         <w:pStyle w:val="Bibliography"/>
       </w:pPr>
       <w:r>
-        <w:t xml:space="preserve">[40]</w:t>
+        <w:t xml:space="preserve">[41]</w:t>
       </w:r>
       <w:r>
         <w:t xml:space="preserve"> </w:t>
@@ -18029,12 +18240,26 @@
         <w:t xml:space="preserve">Proceedings of the 27th ACM SIGKDD conference on knowledge discovery &amp; data mining</w:t>
       </w:r>
       <w:r>
-        <w:t xml:space="preserve">, 2021, pp. 2485–2494.</w:t>
-      </w:r>
-    </w:p>
-    <w:bookmarkEnd w:id="132"/>
-    <w:bookmarkEnd w:id="133"/>
-    <w:bookmarkEnd w:id="134"/>
+        <w:t xml:space="preserve">, 2021, pp. 2485–2494. doi:</w:t>
+      </w:r>
+      <w:r>
+        <w:t xml:space="preserve"> </w:t>
+      </w:r>
+      <w:hyperlink r:id="rId144">
+        <w:r>
+          <w:rPr>
+            <w:rStyle w:val="Hyperlink"/>
+          </w:rPr>
+          <w:t xml:space="preserve">10.1145/3447548.3467174</w:t>
+        </w:r>
+      </w:hyperlink>
+      <w:r>
+        <w:t xml:space="preserve">.</w:t>
+      </w:r>
+    </w:p>
+    <w:bookmarkEnd w:id="145"/>
+    <w:bookmarkEnd w:id="146"/>
+    <w:bookmarkEnd w:id="147"/>
     <w:sectPr/>
   </w:body>
 </w:document>

</xml_diff>

<commit_message>
Architecture diagrams for both papers: DAMAD pipeline (paper 1, Figure 2) and the measurement-study pipeline (paper 2, Figure 1); rebuild both manuscripts
Co-Authored-By: Claude Fable 5.1 <noreply@anthropic.com>
Claude-Session: https://claude.ai/code/session_01BowwkLMYwXCaivyHiAeZQc
</commit_message>
<xml_diff>
--- a/paper/manuscript.docx
+++ b/paper/manuscript.docx
@@ -4584,14 +4584,14 @@
       <w:r>
         <w:drawing>
           <wp:inline>
-            <wp:extent cx="5302908" cy="2724850"/>
+            <wp:extent cx="5334000" cy="4546022"/>
             <wp:effectExtent b="0" l="0" r="0" t="0"/>
-            <wp:docPr descr="Figure 2. DAMAD. Solid arrows are the steady-state path taken at every step; dashed arrows fire only after a confirmed regime change." title="" id="38" name="Picture"/>
+            <wp:docPr descr="Figure 2. DAMAD, band by band. A: what is prepared once, offline (regimes, episodes, the meta-trained starting point θ*). B: the path every window takes while the plant runs. C: the residual-side drift gate that decides whether the plant has changed. D: the six things that happen after a confirmed change, including the safety check that undoes an adaptation if the old model turns out to fit better. Dashed arrows carry the adapted model and the new threshold back into the per-step path." title="" id="38" name="Picture"/>
             <a:graphic>
               <a:graphicData uri="http://schemas.openxmlformats.org/drawingml/2006/picture">
                 <pic:pic>
                   <pic:nvPicPr>
-                    <pic:cNvPr descr="../figures/fig_architecture.png" id="39" name="Picture"/>
+                    <pic:cNvPr descr="../figures/fig_damad_architecture.png" id="39" name="Picture"/>
                     <pic:cNvPicPr>
                       <a:picLocks noChangeArrowheads="1" noChangeAspect="1"/>
                     </pic:cNvPicPr>
@@ -4605,7 +4605,7 @@
                   <pic:spPr bwMode="auto">
                     <a:xfrm>
                       <a:off x="0" y="0"/>
-                      <a:ext cx="5302908" cy="2724850"/>
+                      <a:ext cx="5334000" cy="4546022"/>
                     </a:xfrm>
                     <a:prstGeom prst="rect">
                       <a:avLst/>
@@ -4629,7 +4629,7 @@
         <w:pStyle w:val="ImageCaption"/>
       </w:pPr>
       <w:r>
-        <w:t xml:space="preserve">Figure 2. DAMAD. Solid arrows are the steady-state path taken at every step; dashed arrows fire only after a confirmed regime change.</w:t>
+        <w:t xml:space="preserve">Figure 2. DAMAD, band by band. A: what is prepared once, offline (regimes, episodes, the meta-trained starting point θ*). B: the path every window takes while the plant runs. C: the residual-side drift gate that decides whether the plant has changed. D: the six things that happen after a confirmed change, including the safety check that undoes an adaptation if the old model turns out to fit better. Dashed arrows carry the adapted model and the new threshold back into the per-step path.</w:t>
       </w:r>
     </w:p>
     <w:bookmarkEnd w:id="40"/>

</xml_diff>

<commit_message>
Review method: state the IEEE Xplore field scope of the primary string
Co-Authored-By: Claude Fable 5.1 <noreply@anthropic.com>
Claude-Session: https://claude.ai/code/session_01BowwkLMYwXCaivyHiAeZQc
</commit_message>
<xml_diff>
--- a/paper/manuscript.docx
+++ b/paper/manuscript.docx
@@ -2114,7 +2114,25 @@
         <w:t xml:space="preserve">”</w:t>
       </w:r>
       <w:r>
-        <w:t xml:space="preserve">). The IEEE Xplore export was run with the primary string; Lens.org was run with both.</w:t>
+        <w:t xml:space="preserve">). The IEEE Xplore export was run with the primary string, each term applied to the</w:t>
+      </w:r>
+      <w:r>
+        <w:t xml:space="preserve"> </w:t>
+      </w:r>
+      <w:r>
+        <w:t xml:space="preserve">“</w:t>
+      </w:r>
+      <w:r>
+        <w:t xml:space="preserve">All Metadata</w:t>
+      </w:r>
+      <w:r>
+        <w:t xml:space="preserve">”</w:t>
+      </w:r>
+      <w:r>
+        <w:t xml:space="preserve"> </w:t>
+      </w:r>
+      <w:r>
+        <w:t xml:space="preserve">field (title, abstract and index terms); Lens.org was run with both strings.</w:t>
       </w:r>
     </w:p>
     <w:p>

</xml_diff>

<commit_message>
Second-pass screening corrections (66-paper corpus), sentence-level edits for plain voice in both manuscripts, rebuild
Co-Authored-By: Claude Fable 5.1 <noreply@anthropic.com>
Claude-Session: https://claude.ai/code/session_01BowwkLMYwXCaivyHiAeZQc
</commit_message>
<xml_diff>
--- a/paper/manuscript.docx
+++ b/paper/manuscript.docx
@@ -276,7 +276,7 @@
         <w:pStyle w:val="FirstParagraph"/>
       </w:pPr>
       <w:r>
-        <w:t xml:space="preserve">Sensor streams from industrial plants have to be watched for faults with almost no labelled examples, under distributions that keep moving, and with new fault types showing up after deployment. Meta-learning is built for the few-shot part of that problem, but a systematic review we carried out of 67 peer-reviewed papers (2020–2025) found no method that combines meta-learning with online adaptation on a non-stationary stream and is evaluated on an industrial benchmark. This paper closes that gap in three steps. First, we condense the review into a four-dimensional taxonomy of meta-learning anomaly detectors and a benchmarking protocol with strictly point-wise metrics, controlled drift injection, and three streaming measures (detection latency, adaptation steps, false-alarm rate under drift). Second, we build DAMAD, the Drift-Aware Meta-Adaptive Detector, as a working system: a MAML++-initialised variational autoencoder that adapts in K gradient steps when a regime change is confirmed, a regime-indexed memory that replays past regimes during meta-updates, a gated extreme-value threshold, and a champion/challenger check that undoes an adaptation if the old model turns out to fit the following data better. Building it changed two design decisions from our earlier conceptual sketch: the drift gate has to watch the model residual rather than the raw input, and a change has to be confirmed by the gain it brings, otherwise long anomalies masquerade as drift. Third, we run DAMAD against eight baselines (Isolation Forest, static, fine-tuned, incrementally updated and drift-aware VAEs, MAML and Meta-SGD adapted once, and an MMD-triggered meta-adapter) on eight benchmarks, SWaT, WADI, HAI 21.03, SMAP, MSL, SMD, SKAB and PSM, over five seeds, four drift patterns and ten ablations, 19,650 streaming runs in all. Without injected drift, the static VAE is as good as any meta-learned detector on six of the eight, and the number of support windows makes no difference between one and ten: the initialisation is not the bottleneck. SWaT and WADI are the exception, because their attack recordings sit at a different operating point from their normal recordings: there the static and adapt-once detectors alarm on 49–74 % of normal steps and DAMAD on 4–6 %, with F1 55 against 26 on SWaT. Under injected drift the static and adapt-once detectors alarm on 73–87 % of normal steps pooled (95–100 % on SWaT, WADI and PSM) and do not recover; DAMAD keeps the rate at 17–30 %, recovers within 230–440 windows, and has the best pooled point-wise F1 under every pattern, driven by SWaT, WADI and SMD. On HAI it brings no gain, on SMAP and MSL every method is weak, and its recalibrated thresholds cost it detection latency everywhere. The ablations show that threshold recalibration and the residual-side gate carry the result, the acceptance test matters where anomalies are long, replay helps on some streams and hurts on SWaT, and the choice of meta-learner is secondary. Code, loaders and every result table are released.</w:t>
+        <w:t xml:space="preserve">Sensor streams from industrial plants have to be watched for faults with almost no labelled examples, under distributions that keep moving, and with new fault types showing up after deployment. Meta-learning is built for the few-shot part of that problem, but a systematic review we carried out of 66 peer-reviewed papers (2020–2025) found no method that combines meta-learning with online adaptation on a non-stationary stream and is evaluated on an industrial benchmark. This paper closes that gap in three steps. First, we condense the review into a four-dimensional taxonomy of meta-learning anomaly detectors and a benchmarking protocol with strictly point-wise metrics, controlled drift injection, and three streaming measures (detection latency, adaptation steps, false-alarm rate under drift). Second, we build DAMAD, the Drift-Aware Meta-Adaptive Detector, as a working system: a MAML++-initialised variational autoencoder that adapts in K gradient steps when a regime change is confirmed, a regime-indexed memory that replays past regimes during meta-updates, a gated extreme-value threshold, and a champion/challenger check that undoes an adaptation if the old model turns out to fit the following data better. Building it changed two design decisions from our earlier conceptual sketch: the drift gate has to watch the model residual rather than the raw input, and a change has to be confirmed by the gain it brings, otherwise long anomalies masquerade as drift. Third, we run DAMAD against eight baselines (Isolation Forest, static, fine-tuned, incrementally updated and drift-aware VAEs, MAML and Meta-SGD adapted once, and an MMD-triggered meta-adapter) on eight benchmarks, SWaT, WADI, HAI 21.03, SMAP, MSL, SMD, SKAB and PSM, over five seeds, four drift patterns and ten ablations, 19,650 streaming runs in all. Without injected drift, the static VAE is as good as any meta-learned detector on six of the eight, and the number of support windows makes no difference between one and ten: the initialisation is not the bottleneck. SWaT and WADI are the exception, because their attack recordings sit at a different operating point from their normal recordings: there the static and adapt-once detectors alarm on 49–74 % of normal steps and DAMAD on 4–6 %, with F1 55 against 26 on SWaT. Under injected drift the static and adapt-once detectors alarm on 73–87 % of normal steps pooled (95–100 % on SWaT, WADI and PSM) and do not recover; DAMAD keeps the rate at 17–30 %, recovers within 230–440 windows, and has the best pooled point-wise F1 under every pattern, driven by SWaT, WADI and SMD. On HAI it brings no gain, on SMAP and MSL every method is weak, and its recalibrated thresholds cost it detection latency everywhere. The ablations show that threshold recalibration and the residual-side gate carry the result, the acceptance test matters where anomalies are long, replay helps on some streams and hurts on SWaT, and the choice of meta-learner is secondary. Code, loaders and every result table are released.</w:t>
       </w:r>
     </w:p>
     <w:p>
@@ -527,7 +527,7 @@
         <w:pStyle w:val="Compact"/>
       </w:pPr>
       <w:r>
-        <w:t xml:space="preserve">A four-dimensional taxonomy of meta-learning AD methods (paradigm, detection mechanism, streaming capability, industrial validation) grounded in a PRISMA-style review of 67 papers, and a gap map showing that the online meta-adaptive column of that taxonomy is empty (Section 3).</w:t>
+        <w:t xml:space="preserve">A four-dimensional taxonomy of meta-learning AD methods (paradigm, detection mechanism, streaming capability, industrial validation) grounded in a PRISMA-style review of 66 papers, and a gap map showing that the online meta-adaptive column of that taxonomy is empty (Section 3).</w:t>
       </w:r>
     </w:p>
     <w:p>
@@ -1701,7 +1701,7 @@
         <w:t xml:space="preserve"> </w:t>
       </w:r>
       <w:r>
-        <w:t xml:space="preserve">as far as a two-author study allows, and this section states exactly what was done rather than what a full-scale review would do. Two sources were searched for January 2018 to December 2025, the period since MAML</w:t>
+        <w:t xml:space="preserve">as far as a two-author study allows. This section states what was done, not what a full-scale review would do. Two sources were searched for January 2018 to December 2025, the period since MAML</w:t>
       </w:r>
       <w:r>
         <w:t xml:space="preserve"> </w:t>
@@ -2140,7 +2140,7 @@
         <w:pStyle w:val="BodyText"/>
       </w:pPr>
       <w:r>
-        <w:t xml:space="preserve">Table 1 lists the inclusion and exclusion criteria and Table 2 the selection. The three exports held 788 records (IEEE Xplore 188, Lens primary 124, Lens secondary 476); matching on DOI and then on normalised title removed 93 duplicates within and across sources, leaving 695 unique works. Screening ran in three steps. First, 466 records whose title, abstract and keywords contain no meta-learning or few-shot term (meta-learning, few-shot, one-shot, MAML, prototypical, Siamese, metric learning, learning to learn) were excluded under EC1 without further reading; almost all of them are the drift-and-AD papers that the secondary string was designed to retrieve, and they inform Section 2.3 but are not meta-learning papers. Second, 29 of the remaining 229 records were preprints, book chapters, editorials, datasets, reports or theses and were excluded under EC4. Third, the remaining 200 records were read at title-and-abstract level by the first author: 82 were excluded under EC1 (meta-learning in the stacking-ensemble, AutoML or hyper-parameter sense, few-shot learning mentioned only as motivation, or no anomaly or fault detection task), 50 under EC2 as image-only, two as surveys with no method to classify, one under EC3 as a plain application of an existing method, and 65 were retained. Two papers that we knew from earlier reading and that meet the criteria but were not retrieved by either string, MAVAE</w:t>
+        <w:t xml:space="preserve">Table 1 lists the inclusion and exclusion criteria and Table 2 the selection. The three exports held 788 records (IEEE Xplore 188, Lens primary 124, Lens secondary 476); matching on DOI and then on normalised title removed 93 duplicates within and across sources, leaving 695 unique works. Screening ran in three steps. First, 466 records whose title, abstract and keywords contain no meta-learning or few-shot term (meta-learning, few-shot, one-shot, MAML, prototypical, Siamese, metric learning, learning to learn) were excluded under EC1 without further reading; almost all of them are the drift-and-AD papers that the secondary string was designed to retrieve, and they inform Section 2.3 but are not meta-learning papers. Second, 29 of the remaining 229 records were preprints, book chapters, editorials, datasets, reports or theses and were excluded under EC4. Third, the remaining 200 records were read at title-and-abstract level by the first author: 83 were excluded under EC1 (meta-learning in the stacking-ensemble, AutoML or hyper-parameter sense, few-shot learning mentioned only as motivation, or no anomaly or fault detection task), 50 under EC2 as image-only, two as surveys with no method to classify, one under EC3 as a plain application of an existing method, and 64 were retained. Two papers that we knew from earlier reading and that meet the criteria but were not retrieved by either string, MAVAE</w:t>
       </w:r>
       <w:r>
         <w:t xml:space="preserve"> </w:t>
@@ -2171,7 +2171,7 @@
         </w:r>
       </w:hyperlink>
       <w:r>
-        <w:t xml:space="preserve">, were added from our reference list. The corpus is 67 papers. One in 2020, three in 2021, five in 2022, 13 in 2023, 13 in 2024 and 32 in 2025: 87 % of it is from 2023 onwards, and nothing before 2020 survived screening. Appendix A lists every paper with its DOI and its codes.</w:t>
+        <w:t xml:space="preserve">, were added from our reference list. The corpus is 66 papers. One in 2020, three in 2021, five in 2022, 13 in 2023, 13 in 2024 and 31 in 2025: 86 % of it is from 2023 onwards, and nothing before 2020 survived screening. Appendix A lists every paper with its DOI and its codes.</w:t>
       </w:r>
     </w:p>
     <w:p>
@@ -2623,7 +2623,7 @@
               <w:jc w:val="left"/>
             </w:pPr>
             <w:r>
-              <w:t xml:space="preserve">82 EC1, 50 EC2, 2 surveys, 1 EC3; 65 retained</w:t>
+              <w:t xml:space="preserve">83 EC1, 50 EC2, 2 surveys, 1 EC3; 64 retained</w:t>
             </w:r>
           </w:p>
         </w:tc>
@@ -2675,7 +2675,7 @@
               <w:jc w:val="left"/>
             </w:pPr>
             <w:r>
-              <w:t xml:space="preserve">67 papers</w:t>
+              <w:t xml:space="preserve">66 papers</w:t>
             </w:r>
           </w:p>
         </w:tc>
@@ -2913,7 +2913,7 @@
         <w:pStyle w:val="BodyText"/>
       </w:pPr>
       <w:r>
-        <w:t xml:space="preserve">Table 3 places representative papers on the grid, and Figure 1 plots the whole corpus on the D1 × D3 plane. Metric-based methods are the largest group, 22 of the 67 papers (33 %); optimisation-based methods follow with 19 (28 %); 11 (16 %) are few-shot methods with no meta-learning paradigm at all, mostly transfer learning with a handful of target samples; four are model-based, two hybrid, and nine state no paradigm in the abstract. On D2 the corpus is dominated by supervised few-shot classification of known fault classes (33 papers, 49 %), which is the bearing and motor fault-diagnosis literature; 20 papers score by distance to prototypes, eight by reconstruction, one by prediction and five by a combination. On D3, 62 papers (93 %) are static, four update incrementally</w:t>
+        <w:t xml:space="preserve">Table 3 places representative papers on the grid, and Figure 1 plots the whole corpus on the D1 × D3 plane. Metric-based methods are the largest group, 22 of the 66 papers (33 %); optimisation-based methods follow with 18 (27 %); ten (15 %) are few-shot methods with no meta-learning paradigm at all, mostly transfer learning with a handful of target samples; four are model-based, two hybrid, and ten state no paradigm in the abstract. On D2 the corpus is dominated by supervised few-shot classification of known fault classes (31 papers, 47 %), which is the bearing and motor fault-diagnosis literature; 21 papers score by distance to prototypes, eight by reconstruction, one by prediction and five by a combination. On D3, 62 papers (94 %) are static, three update incrementally</w:t>
       </w:r>
       <w:r>
         <w:t xml:space="preserve"> </w:t>
@@ -2972,7 +2972,7 @@
         </w:r>
       </w:hyperlink>
       <w:r>
-        <w:t xml:space="preserve">, detects drift before it adapts. On D4, one paper</w:t>
+        <w:t xml:space="preserve">, detects drift before it adapts. On D4, two papers</w:t>
       </w:r>
       <w:r>
         <w:t xml:space="preserve"> </w:t>
@@ -2986,10 +2986,24 @@
         </w:r>
       </w:hyperlink>
       <w:r>
-        <w:t xml:space="preserve"> </w:t>
-      </w:r>
-      <w:r>
-        <w:t xml:space="preserve">uses the industrial benchmarks of this study, 61 use other IoT, industrial or network data and five use generic data.</w:t>
+        <w:t xml:space="preserve">,</w:t>
+      </w:r>
+      <w:r>
+        <w:t xml:space="preserve"> </w:t>
+      </w:r>
+      <w:hyperlink w:anchor="ref-xu2025swat">
+        <w:r>
+          <w:rPr>
+            <w:rStyle w:val="Hyperlink"/>
+          </w:rPr>
+          <w:t xml:space="preserve">[37]</w:t>
+        </w:r>
+      </w:hyperlink>
+      <w:r>
+        <w:t xml:space="preserve"> </w:t>
+      </w:r>
+      <w:r>
+        <w:t xml:space="preserve">use the industrial benchmarks of this study, 59 use other IoT, industrial or network data and five use generic data.</w:t>
       </w:r>
     </w:p>
     <w:p>
@@ -3220,7 +3234,7 @@
                 <w:rPr>
                   <w:rStyle w:val="Hyperlink"/>
                 </w:rPr>
-                <w:t xml:space="preserve">[37]</w:t>
+                <w:t xml:space="preserve">[38]</w:t>
               </w:r>
             </w:hyperlink>
           </w:p>
@@ -3305,7 +3319,7 @@
                 <w:rPr>
                   <w:rStyle w:val="Hyperlink"/>
                 </w:rPr>
-                <w:t xml:space="preserve">[38]</w:t>
+                <w:t xml:space="preserve">[39]</w:t>
               </w:r>
             </w:hyperlink>
           </w:p>
@@ -3566,7 +3580,7 @@
                 <w:rPr>
                   <w:rStyle w:val="Hyperlink"/>
                 </w:rPr>
-                <w:t xml:space="preserve">[39]</w:t>
+                <w:t xml:space="preserve">[40]</w:t>
               </w:r>
             </w:hyperlink>
           </w:p>
@@ -4003,7 +4017,7 @@
                 <w:rPr>
                   <w:rStyle w:val="Hyperlink"/>
                 </w:rPr>
-                <w:t xml:space="preserve">[40]</w:t>
+                <w:t xml:space="preserve">[41]</w:t>
               </w:r>
             </w:hyperlink>
           </w:p>
@@ -4493,7 +4507,7 @@
           <wp:inline>
             <wp:extent cx="4533900" cy="2770716"/>
             <wp:effectExtent b="0" l="0" r="0" t="0"/>
-            <wp:docPr descr="Figure 1. Coverage of the 67 reviewed papers on the D1 × D3 plane. The online meta-adaptive column is empty for every paradigm; the drift-aware column holds one paper. The bottom-right cell of the original sketch, hybrid and online meta-adaptive, is the target of this work." title="" id="28" name="Picture"/>
+            <wp:docPr descr="Figure 1. Coverage of the 66 reviewed papers on the D1 × D3 plane. The online meta-adaptive column is empty for every paradigm; the drift-aware column holds one paper. The bottom-right cell of the original sketch, hybrid and online meta-adaptive, is the target of this work." title="" id="28" name="Picture"/>
             <a:graphic>
               <a:graphicData uri="http://schemas.openxmlformats.org/drawingml/2006/picture">
                 <pic:pic>
@@ -4536,7 +4550,7 @@
         <w:pStyle w:val="ImageCaption"/>
       </w:pPr>
       <w:r>
-        <w:t xml:space="preserve">Figure 1. Coverage of the 67 reviewed papers on the D1 × D3 plane. The online meta-adaptive column is empty for every paradigm; the drift-aware column holds one paper. The bottom-right cell of the original sketch, hybrid and online meta-adaptive, is the target of this work.</w:t>
+        <w:t xml:space="preserve">Figure 1. Coverage of the 66 reviewed papers on the D1 × D3 plane. The online meta-adaptive column is empty for every paradigm; the drift-aware column holds one paper. The bottom-right cell of the original sketch, hybrid and online meta-adaptive, is the target of this work.</w:t>
       </w:r>
     </w:p>
     <w:bookmarkEnd w:id="30"/>
@@ -4564,7 +4578,7 @@
         <w:t xml:space="preserve"> </w:t>
       </w:r>
       <w:r>
-        <w:t xml:space="preserve">62 of the 67 papers sit in the STA column, and the four that update do so by adding fault classes or samples, not by watching the stream. Methods designed for offline training are being applied to a problem that is online by nature. The finding has a second face that the D2 counts show: half of the corpus treats the problem as supervised classification of fault classes seen at training time, which is a different problem from detecting a fault that has never been seen.</w:t>
+        <w:t xml:space="preserve">62 of the 66 papers sit in the STA column, and the three that update do so by adding fault classes or samples, not by watching the stream. Methods designed for offline training are being applied to a problem that is online by nature. The finding has a second face that the D2 counts show: half of the corpus treats the problem as supervised classification of fault classes seen at training time, which is a different problem from detecting a fault that has never been seen.</w:t>
       </w:r>
     </w:p>
     <w:p>
@@ -4614,7 +4628,7 @@
         <w:t xml:space="preserve"> </w:t>
       </w:r>
       <w:r>
-        <w:t xml:space="preserve">One paper in the corpus evaluates on the industrial benchmarks of this study: TranAD</w:t>
+        <w:t xml:space="preserve">Two papers in the corpus evaluate on the industrial benchmarks of this study. TranAD</w:t>
       </w:r>
       <w:r>
         <w:t xml:space="preserve"> </w:t>
@@ -4628,7 +4642,27 @@
         </w:r>
       </w:hyperlink>
       <w:r>
-        <w:t xml:space="preserve">, a transformer reconstruction detector that uses MAML during training so that it can be trained on a fraction of the data, and that reports on SWaT, WADI, SMAP, MSL and SMD. Its meta-learning is a training aid; nothing is adapted at deployment, and its scores are point-adjusted. Every other paper that meta-learns is evaluated on bearing and motor rigs, process datasets, intrusion datasets or telemetry without a named benchmark, and no paper evaluates few-shot</w:t>
+        <w:t xml:space="preserve"> </w:t>
+      </w:r>
+      <w:r>
+        <w:t xml:space="preserve">is a transformer reconstruction detector that uses MAML during training so that it can be trained on a fraction of the data, and it reports on SWaT, WADI, SMAP, MSL and SMD; its meta-learning is a training aid, nothing is adapted at deployment, and its scores are point-adjusted. Xu et al.</w:t>
+      </w:r>
+      <w:r>
+        <w:t xml:space="preserve"> </w:t>
+      </w:r>
+      <w:hyperlink w:anchor="ref-xu2025swat">
+        <w:r>
+          <w:rPr>
+            <w:rStyle w:val="Hyperlink"/>
+          </w:rPr>
+          <w:t xml:space="preserve">[37]</w:t>
+        </w:r>
+      </w:hyperlink>
+      <w:r>
+        <w:t xml:space="preserve"> </w:t>
+      </w:r>
+      <w:r>
+        <w:t xml:space="preserve">detect SWaT attacks with an LSTM-UNet trained on augmented attack samples, a supervised few-shot classifier with no meta-learning. Every other paper that meta-learns is evaluated on bearing and motor rigs, process datasets, intrusion datasets or telemetry without a named benchmark, and no paper evaluates few-shot</w:t>
       </w:r>
       <w:r>
         <w:t xml:space="preserve"> </w:t>
@@ -4644,7 +4678,7 @@
         <w:t xml:space="preserve"> </w:t>
       </w:r>
       <w:r>
-        <w:t xml:space="preserve">on SWaT, WADI, HAI, SMAP or MSL. The benchmarks exist and the methods exist; the two have not met.</w:t>
+        <w:t xml:space="preserve">on SWaT, WADI, HAI, SMAP or MSL. Nobody has yet put the two together.</w:t>
       </w:r>
     </w:p>
     <w:p>
@@ -4861,7 +4895,7 @@
           <w:rPr>
             <w:rStyle w:val="Hyperlink"/>
           </w:rPr>
-          <w:t xml:space="preserve">[41]</w:t>
+          <w:t xml:space="preserve">[42]</w:t>
         </w:r>
       </w:hyperlink>
       <w:r>
@@ -4875,7 +4909,7 @@
           <w:rPr>
             <w:rStyle w:val="Hyperlink"/>
           </w:rPr>
-          <w:t xml:space="preserve">[42]</w:t>
+          <w:t xml:space="preserve">[43]</w:t>
         </w:r>
       </w:hyperlink>
       <w:r>
@@ -4889,7 +4923,7 @@
           <w:rPr>
             <w:rStyle w:val="Hyperlink"/>
           </w:rPr>
-          <w:t xml:space="preserve">[43]</w:t>
+          <w:t xml:space="preserve">[44]</w:t>
         </w:r>
       </w:hyperlink>
       <w:r>
@@ -5149,7 +5183,7 @@
                 <w:rPr>
                   <w:rStyle w:val="Hyperlink"/>
                 </w:rPr>
-                <w:t xml:space="preserve">[44]</w:t>
+                <w:t xml:space="preserve">[45]</w:t>
               </w:r>
             </w:hyperlink>
             <w:r>
@@ -5727,7 +5761,7 @@
           <w:rPr>
             <w:rStyle w:val="Hyperlink"/>
           </w:rPr>
-          <w:t xml:space="preserve">[44]</w:t>
+          <w:t xml:space="preserve">[45]</w:t>
         </w:r>
       </w:hyperlink>
       <w:r>
@@ -5925,7 +5959,7 @@
           <w:rPr>
             <w:rStyle w:val="Hyperlink"/>
           </w:rPr>
-          <w:t xml:space="preserve">[45]</w:t>
+          <w:t xml:space="preserve">[46]</w:t>
         </w:r>
       </w:hyperlink>
       <w:r>
@@ -6084,7 +6118,7 @@
           <w:rPr>
             <w:rStyle w:val="Hyperlink"/>
           </w:rPr>
-          <w:t xml:space="preserve">[46]</w:t>
+          <w:t xml:space="preserve">[47]</w:t>
         </w:r>
       </w:hyperlink>
       <w:r>
@@ -6111,7 +6145,7 @@
           <w:rPr>
             <w:rStyle w:val="Hyperlink"/>
           </w:rPr>
-          <w:t xml:space="preserve">[47]</w:t>
+          <w:t xml:space="preserve">[48]</w:t>
         </w:r>
       </w:hyperlink>
       <w:r>
@@ -6138,7 +6172,7 @@
           <w:rPr>
             <w:rStyle w:val="Hyperlink"/>
           </w:rPr>
-          <w:t xml:space="preserve">[48]</w:t>
+          <w:t xml:space="preserve">[49]</w:t>
         </w:r>
       </w:hyperlink>
       <w:r>
@@ -7214,7 +7248,7 @@
                 <w:rPr>
                   <w:rStyle w:val="Hyperlink"/>
                 </w:rPr>
-                <w:t xml:space="preserve">[49]</w:t>
+                <w:t xml:space="preserve">[50]</w:t>
               </w:r>
             </w:hyperlink>
           </w:p>
@@ -11511,7 +11545,7 @@
         <w:pStyle w:val="FirstParagraph"/>
       </w:pPr>
       <w:r>
-        <w:t xml:space="preserve">Tables 11 to 13 report the drift conditions on the seven datasets that are long enough for them, with K = 5, pooled by condition and per dataset averaged over the four patterns; Figure 4 plots the pooled F1 and false-alarm rate. The false-alarm rate after the first change point (Table 12) is where the methods separate. Pooled over datasets, the static VAE alarms on 75–87 % of normal steps after a change; the meta-learned detectors adapted once do the same (73–83 %), and OML-A, which adapts on an MMD trigger but never moves its threshold, is barely better (72–81 %). On SWaT, WADI and PSM the whole static group is at 95–100 %. These detectors have not failed to see the anomalies; they have stopped being able to say anything, because almost every step is above the threshold that was set in the first regime. The incrementally updated VAE sits in the middle (44–82 %), and is the best method under incremental drift on four datasets, where a slow shift is exactly what one optimiser step every five windows can follow. The two drift-aware methods are the only ones that keep the rate low in every condition: 21–33 % for VAE-DFT and 17–30 % for DAMAD. Per dataset, DAMAD has the lowest rate on SMD, PSM, SWaT and WADI (11–27 %), VAE-DFT on SMAP and MSL, and the incremental VAE on HAI.</w:t>
+        <w:t xml:space="preserve">Tables 11 to 13 report the drift conditions on the seven datasets that are long enough for them, with K = 5, pooled by condition and per dataset averaged over the four patterns; Figure 4 plots the pooled F1 and false-alarm rate. The false-alarm rate after the first change point (Table 12) is where the methods separate. Pooled over datasets, the static VAE alarms on 75–87 % of normal steps after a change; the meta-learned detectors adapted once do the same (73–83 %), and OML-A, which adapts on an MMD trigger but never moves its threshold, is barely better (72–81 %). On SWaT, WADI and PSM the whole static group is at 95–100 %. These detectors still see the anomalies. The trouble is that almost every normal step is also above the threshold set in the first regime, so the alarm stream no longer says anything. The incrementally updated VAE sits in the middle (44–82 %), and is the best method under incremental drift on four datasets, where a slow shift is exactly what one optimiser step every five windows can follow. The two drift-aware methods are the only ones that keep the rate low in every condition: 21–33 % for VAE-DFT and 17–30 % for DAMAD. Per dataset, DAMAD has the lowest rate on SMD, PSM, SWaT and WADI (11–27 %), VAE-DFT on SMAP and MSL, and the incremental VAE on HAI.</w:t>
       </w:r>
     </w:p>
     <w:p>
@@ -16391,7 +16425,7 @@
         <w:pStyle w:val="BodyText"/>
       </w:pPr>
       <w:r>
-        <w:t xml:space="preserve">Recovery time tells the same story from the other side (Table 13). After a sudden change the static group needs 2,200–2,300 windows pooled, and on SMD, PSM, SWaT and WADI 2,200–3,100, which is to say it never recovers within the segment; the value is the cap. DAMAD recovers in 230–440 windows depending on the pattern, VAE-DFT in 340–510, and both recover from 97–98 % of change points against 78–85 % for the rest. The adaptation itself takes eleven milliseconds; the time is spent waiting for five support windows and a calibration window, which is the price of setting a threshold without labels.</w:t>
+        <w:t xml:space="preserve">Recovery time (Table 13) shows the same thing from the other side. After a sudden change the static group needs 2,200–2,300 windows pooled, and on SMD, PSM, SWaT and WADI 2,200–3,100, which is to say it never recovers within the segment; the value is the cap. DAMAD recovers in 230–440 windows depending on the pattern, VAE-DFT in 340–510, and both recover from 97–98 % of change points against 78–85 % for the rest. The adaptation itself takes eleven milliseconds; the time is spent waiting for five support windows and a calibration window, which is the price of setting a threshold without labels.</w:t>
       </w:r>
     </w:p>
     <w:p>
@@ -16462,7 +16496,7 @@
         <w:pStyle w:val="BodyText"/>
       </w:pPr>
       <w:r>
-        <w:t xml:space="preserve">Detection latency is the streaming metric on which DAMAD is worst, and the eight-dataset view makes that plainer than the four-dataset one did. Averaged over drift patterns the static and adapt-once detectors raise their first alarm 2–6 windows into an anomaly segment on SMD, PSM, HAI, SWaT and WADI; DAMAD needs 9–31 windows there and 51–144 on the NASA channels, and it detects fewer segments (51–84 % against 80–97 % for the static group on the same datasets). Both follow from the recalibrated threshold being higher than a threshold set once on a quiet first regime; on SWaT and WADI, where DAMAD’s threshold is recalibrated after every one of several confirmed changes, the segment detection rate is only 48–51 %. An operator who wants the earliest possible alarm and can live with alarms on most normal steps after a change should use the static detector; one who needs the alarm stream to stay meaningful after a change cannot. The trade is explicit and we do not hide it.</w:t>
+        <w:t xml:space="preserve">Detection latency is the streaming metric on which DAMAD is worst, and the eight-dataset view makes that plainer than the four-dataset one did. Averaged over drift patterns the static and adapt-once detectors raise their first alarm 2–6 windows into an anomaly segment on SMD, PSM, HAI, SWaT and WADI; DAMAD needs 9–31 windows there and 51–144 on the NASA channels, and it detects fewer segments (51–84 % against 80–97 % for the static group on the same datasets). Both follow from the recalibrated threshold being higher than a threshold set once on a quiet first regime; on SWaT and WADI, where DAMAD’s threshold is recalibrated after every one of several confirmed changes, the segment detection rate is only 48–51 %. An operator who wants the earliest possible alarm and can live with alarms on most normal steps after a change should use the static detector; one who needs the alarm stream to stay meaningful after a change cannot. The trade is explicit.</w:t>
       </w:r>
     </w:p>
     <w:p>
@@ -19612,7 +19646,7 @@
         <w:pStyle w:val="FirstParagraph"/>
       </w:pPr>
       <w:r>
-        <w:t xml:space="preserve">Finding 1 of the review was that static methods are being applied to an online problem. The drift conditions make the cost of that visible: a static VAE whose threshold was set on the first regime alarms on 94 % of normal steps on SMD and 100 % on PSM, SWaT and WADI after a sudden change, and the meta-learned model adapted once (MAML-1) does the same, because a good initialisation does not help a model that is never asked to adapt again. SWaT and WADI show that the problem is not an artefact of injection: on their original attack recordings the same detectors alarm on 73 % and 57 % of normal steps, because the plant was running at a different operating point when the attack data were collected. Finding 2 was that nobody updates the meta-level online. We did, and the honest summary is that the online meta-update (replay) is the smallest part of DAMAD in effect size; the parts that matter are the ones that decide</w:t>
+        <w:t xml:space="preserve">Finding 1 of the review was that static methods are being applied to an online problem. The drift conditions make the cost of that visible: a static VAE whose threshold was set on the first regime alarms on 94 % of normal steps on SMD and 100 % on PSM, SWaT and WADI after a sudden change, and the meta-learned model adapted once (MAML-1) does the same, because a good initialisation does not help a model that is never asked to adapt again. SWaT and WADI show that the problem is not an artefact of injection: on their original attack recordings the same detectors alarm on 73 % and 57 % of normal steps, because the plant was running at a different operating point when the attack data were collected. Finding 2 was that nobody updates the meta-level online. We did, and the plain summary is that the online meta-update (replay) is the smallest part of DAMAD in effect size; the parts that matter are the ones that decide</w:t>
       </w:r>
       <w:r>
         <w:t xml:space="preserve"> </w:t>
@@ -19665,7 +19699,7 @@
         <w:pStyle w:val="BodyText"/>
       </w:pPr>
       <w:r>
-        <w:t xml:space="preserve">A fourth point is not in the review but comes out of Section 7.1 clearly enough to state on its own. For a small reconstruction model, the meta-learned initialisation is not what limits few-shot anomaly detection on these streams. One support window gives the same F1 as ten on every dataset, and a static VAE trained on pooled normal data is as good a starting point as MAML++ or Meta-SGD. The one thing that does move F1 on a cold start is adapting</w:t>
+        <w:t xml:space="preserve">A fourth point is not in the review, but Section 7.1 makes it clearly enough to state on its own. For a small reconstruction model, the meta-learned initialisation is not what limits few-shot anomaly detection on these streams. One support window gives the same F1 as ten on every dataset, and a static VAE trained on pooled normal data is as good a starting point as MAML++ or Meta-SGD. The one thing that does move F1 on a cold start is adapting</w:t>
       </w:r>
       <w:r>
         <w:t xml:space="preserve"> </w:t>
@@ -19984,7 +20018,7 @@
         <w:pStyle w:val="FirstParagraph"/>
       </w:pPr>
       <w:r>
-        <w:t xml:space="preserve">We set out to find a method that is few-shot capable, drift-aware and deployable online for industrial sensor streams, found none in 67 papers, and built one. The review and taxonomy locate the gap; the protocol says how a method in that gap should be measured; DAMAD shows that the gap can be filled with existing parts, provided three things are done that the parts do not do on their own: watch the residual rather than the input, keep the threshold still except after a confirmed change, and let the old model contest every adaptation. On eight benchmarks, including the two water testbeds the field treats as its reference, that is enough to keep the alarm stream meaningful after a change where every static or adapt-once detector stops being useful; it is not enough to match their detection latency, and on telemetry channels the base learner, not the adaptation policy, is the limit. The remaining distance to a production system is in robust threshold calibration under contamination and in the latency cost of recalibration, and the released code is arranged so that either can be worked on by changing one configuration.</w:t>
+        <w:t xml:space="preserve">We set out to find a method that is few-shot capable, drift-aware and deployable online for industrial sensor streams, found none in 66 papers, and built one. The review and taxonomy locate the gap; the protocol says how a method in that gap should be measured; DAMAD shows that the gap can be filled with existing parts, provided three things are done that the parts do not do on their own: watch the residual rather than the input, keep the threshold still except after a confirmed change, and let the old model contest every adaptation. On eight benchmarks, including the two water testbeds the field treats as its reference, that is enough to keep the alarm stream meaningful after a change where every static or adapt-once detector stops being useful; it is not enough to match their detection latency, and on telemetry channels the base learner, not the adaptation policy, is the limit. The remaining distance to a production system is in robust threshold calibration under contamination and in the latency cost of recalibration, and the released code is arranged so that either can be worked on by changing one configuration.</w:t>
       </w:r>
     </w:p>
     <w:bookmarkEnd w:id="79"/>
@@ -20024,7 +20058,7 @@
       </w:r>
     </w:p>
     <w:bookmarkEnd w:id="81"/>
-    <w:bookmarkStart w:id="163" w:name="appendix-a.-the-review-corpus"/>
+    <w:bookmarkStart w:id="165" w:name="appendix-a.-the-review-corpus"/>
     <w:p>
       <w:pPr>
         <w:pStyle w:val="Heading1"/>
@@ -20038,7 +20072,7 @@
         <w:pStyle w:val="FirstParagraph"/>
       </w:pPr>
       <w:r>
-        <w:t xml:space="preserve">The 67 papers of Section 3 with the codes of the four taxonomy axes (D1 paradigm, D2 mechanism, D3 streaming capability, D4 validation; abbreviations as in Section 3.2). The screening sheet with every excluded record and its reason is released with the code.</w:t>
+        <w:t xml:space="preserve">The 66 papers of Section 3 with the codes of the four taxonomy axes (D1 paradigm, D2 mechanism, D3 streaming capability, D4 validation; abbreviations as in Section 3.2). The screening sheet with every excluded record and its reason is released with the code.</w:t>
       </w:r>
     </w:p>
     <w:tbl>
@@ -20742,19 +20776,19 @@
               <w:jc w:val="left"/>
             </w:pPr>
             <w:r>
-              <w:t xml:space="preserve">NML</w:t>
-            </w:r>
-          </w:p>
-        </w:tc>
-        <w:tc>
-          <w:tcPr/>
-          <w:p>
-            <w:pPr>
-              <w:pStyle w:val="Compact"/>
-              <w:jc w:val="left"/>
-            </w:pPr>
-            <w:r>
-              <w:t xml:space="preserve">CLS</w:t>
+              <w:t xml:space="preserve">MET</w:t>
+            </w:r>
+          </w:p>
+        </w:tc>
+        <w:tc>
+          <w:tcPr/>
+          <w:p>
+            <w:pPr>
+              <w:pStyle w:val="Compact"/>
+              <w:jc w:val="left"/>
+            </w:pPr>
+            <w:r>
+              <w:t xml:space="preserve">DIS</w:t>
             </w:r>
           </w:p>
         </w:tc>
@@ -21486,7 +21520,7 @@
               <w:jc w:val="left"/>
             </w:pPr>
             <w:r>
-              <w:t xml:space="preserve">CLS</w:t>
+              <w:t xml:space="preserve">DIS</w:t>
             </w:r>
           </w:p>
         </w:tc>
@@ -25134,7 +25168,7 @@
               <w:jc w:val="left"/>
             </w:pPr>
             <w:r>
-              <w:t xml:space="preserve">OPT</w:t>
+              <w:t xml:space="preserve">NS</w:t>
             </w:r>
           </w:p>
         </w:tc>
@@ -25158,7 +25192,7 @@
               <w:jc w:val="left"/>
             </w:pPr>
             <w:r>
-              <w:t xml:space="preserve">INC</w:t>
+              <w:t xml:space="preserve">STA</w:t>
             </w:r>
           </w:p>
         </w:tc>
@@ -27538,55 +27572,55 @@
               <w:jc w:val="left"/>
             </w:pPr>
             <w:r>
-              <w:t xml:space="preserve">Z. Li</w:t>
-            </w:r>
-          </w:p>
-        </w:tc>
-        <w:tc>
-          <w:tcPr/>
-          <w:p>
-            <w:pPr>
-              <w:pStyle w:val="Compact"/>
-              <w:jc w:val="left"/>
-            </w:pPr>
-            <w:r>
-              <w:t xml:space="preserve">Semi-Supervised Anomaly Detection in Satellite Sensor Data under Missing Values and Class Imbalance</w:t>
-            </w:r>
-          </w:p>
-        </w:tc>
-        <w:tc>
-          <w:tcPr/>
-          <w:p>
-            <w:pPr>
-              <w:pStyle w:val="Compact"/>
-              <w:jc w:val="left"/>
-            </w:pPr>
-            <w:r>
-              <w:t xml:space="preserve">2025 6th International Conference on Internet of Things, Art</w:t>
-            </w:r>
-          </w:p>
-        </w:tc>
-        <w:tc>
-          <w:tcPr/>
-          <w:p>
-            <w:pPr>
-              <w:pStyle w:val="Compact"/>
-              <w:jc w:val="left"/>
-            </w:pPr>
-            <w:r>
-              <w:t xml:space="preserve">MET</w:t>
-            </w:r>
-          </w:p>
-        </w:tc>
-        <w:tc>
-          <w:tcPr/>
-          <w:p>
-            <w:pPr>
-              <w:pStyle w:val="Compact"/>
-              <w:jc w:val="left"/>
-            </w:pPr>
-            <w:r>
-              <w:t xml:space="preserve">DIS</w:t>
+              <w:t xml:space="preserve">R. Xu</w:t>
+            </w:r>
+          </w:p>
+        </w:tc>
+        <w:tc>
+          <w:tcPr/>
+          <w:p>
+            <w:pPr>
+              <w:pStyle w:val="Compact"/>
+              <w:jc w:val="left"/>
+            </w:pPr>
+            <w:r>
+              <w:t xml:space="preserve">Cyber Attack Detection for Industrial Control Systems with Few-Shot and Class Imbalance: An Improved DA-LSTM-UNet Scheme</w:t>
+            </w:r>
+          </w:p>
+        </w:tc>
+        <w:tc>
+          <w:tcPr/>
+          <w:p>
+            <w:pPr>
+              <w:pStyle w:val="Compact"/>
+              <w:jc w:val="left"/>
+            </w:pPr>
+            <w:r>
+              <w:t xml:space="preserve">2025 10th International Conference on Control, Robotics and</w:t>
+            </w:r>
+          </w:p>
+        </w:tc>
+        <w:tc>
+          <w:tcPr/>
+          <w:p>
+            <w:pPr>
+              <w:pStyle w:val="Compact"/>
+              <w:jc w:val="left"/>
+            </w:pPr>
+            <w:r>
+              <w:t xml:space="preserve">NML</w:t>
+            </w:r>
+          </w:p>
+        </w:tc>
+        <w:tc>
+          <w:tcPr/>
+          <w:p>
+            <w:pPr>
+              <w:pStyle w:val="Compact"/>
+              <w:jc w:val="left"/>
+            </w:pPr>
+            <w:r>
+              <w:t xml:space="preserve">CLS</w:t>
             </w:r>
           </w:p>
         </w:tc>
@@ -27610,19 +27644,19 @@
               <w:jc w:val="left"/>
             </w:pPr>
             <w:r>
-              <w:t xml:space="preserve">IOV</w:t>
-            </w:r>
-          </w:p>
-        </w:tc>
-        <w:tc>
-          <w:tcPr/>
-          <w:p>
-            <w:pPr>
-              <w:pStyle w:val="Compact"/>
-              <w:jc w:val="left"/>
-            </w:pPr>
-            <w:r>
-              <w:t xml:space="preserve">10.1109/iotaima66468.2025.11212774</w:t>
+              <w:t xml:space="preserve">IIV</w:t>
+            </w:r>
+          </w:p>
+        </w:tc>
+        <w:tc>
+          <w:tcPr/>
+          <w:p>
+            <w:pPr>
+              <w:pStyle w:val="Compact"/>
+              <w:jc w:val="left"/>
+            </w:pPr>
+            <w:r>
+              <w:t xml:space="preserve">10.1109/crc67523.2025.11288189</w:t>
             </w:r>
           </w:p>
         </w:tc>
@@ -27660,43 +27694,43 @@
               <w:jc w:val="left"/>
             </w:pPr>
             <w:r>
-              <w:t xml:space="preserve">R. Xu</w:t>
-            </w:r>
-          </w:p>
-        </w:tc>
-        <w:tc>
-          <w:tcPr/>
-          <w:p>
-            <w:pPr>
-              <w:pStyle w:val="Compact"/>
-              <w:jc w:val="left"/>
-            </w:pPr>
-            <w:r>
-              <w:t xml:space="preserve">Cyber Attack Detection for Industrial Control Systems with Few-Shot and Class Imbalance: An Improved DA-LSTM-UNet Scheme</w:t>
-            </w:r>
-          </w:p>
-        </w:tc>
-        <w:tc>
-          <w:tcPr/>
-          <w:p>
-            <w:pPr>
-              <w:pStyle w:val="Compact"/>
-              <w:jc w:val="left"/>
-            </w:pPr>
-            <w:r>
-              <w:t xml:space="preserve">2025 10th International Conference on Control, Robotics and</w:t>
-            </w:r>
-          </w:p>
-        </w:tc>
-        <w:tc>
-          <w:tcPr/>
-          <w:p>
-            <w:pPr>
-              <w:pStyle w:val="Compact"/>
-              <w:jc w:val="left"/>
-            </w:pPr>
-            <w:r>
-              <w:t xml:space="preserve">NML</w:t>
+              <w:t xml:space="preserve">W. Xi</w:t>
+            </w:r>
+          </w:p>
+        </w:tc>
+        <w:tc>
+          <w:tcPr/>
+          <w:p>
+            <w:pPr>
+              <w:pStyle w:val="Compact"/>
+              <w:jc w:val="left"/>
+            </w:pPr>
+            <w:r>
+              <w:t xml:space="preserve">MHT: Dual-Layered Meta-Driven Hypernetworks for Unknown Attack Detection</w:t>
+            </w:r>
+          </w:p>
+        </w:tc>
+        <w:tc>
+          <w:tcPr/>
+          <w:p>
+            <w:pPr>
+              <w:pStyle w:val="Compact"/>
+              <w:jc w:val="left"/>
+            </w:pPr>
+            <w:r>
+              <w:t xml:space="preserve">2025 10th International Conference on Computer and Communica</w:t>
+            </w:r>
+          </w:p>
+        </w:tc>
+        <w:tc>
+          <w:tcPr/>
+          <w:p>
+            <w:pPr>
+              <w:pStyle w:val="Compact"/>
+              <w:jc w:val="left"/>
+            </w:pPr>
+            <w:r>
+              <w:t xml:space="preserve">MOD</w:t>
             </w:r>
           </w:p>
         </w:tc>
@@ -27744,7 +27778,7 @@
               <w:jc w:val="left"/>
             </w:pPr>
             <w:r>
-              <w:t xml:space="preserve">10.1109/crc67523.2025.11288189</w:t>
+              <w:t xml:space="preserve">10.1109/icccs65393.2025.11069655</w:t>
             </w:r>
           </w:p>
         </w:tc>
@@ -27782,43 +27816,43 @@
               <w:jc w:val="left"/>
             </w:pPr>
             <w:r>
-              <w:t xml:space="preserve">W. Xi</w:t>
-            </w:r>
-          </w:p>
-        </w:tc>
-        <w:tc>
-          <w:tcPr/>
-          <w:p>
-            <w:pPr>
-              <w:pStyle w:val="Compact"/>
-              <w:jc w:val="left"/>
-            </w:pPr>
-            <w:r>
-              <w:t xml:space="preserve">MHT: Dual-Layered Meta-Driven Hypernetworks for Unknown Attack Detection</w:t>
-            </w:r>
-          </w:p>
-        </w:tc>
-        <w:tc>
-          <w:tcPr/>
-          <w:p>
-            <w:pPr>
-              <w:pStyle w:val="Compact"/>
-              <w:jc w:val="left"/>
-            </w:pPr>
-            <w:r>
-              <w:t xml:space="preserve">2025 10th International Conference on Computer and Communica</w:t>
-            </w:r>
-          </w:p>
-        </w:tc>
-        <w:tc>
-          <w:tcPr/>
-          <w:p>
-            <w:pPr>
-              <w:pStyle w:val="Compact"/>
-              <w:jc w:val="left"/>
-            </w:pPr>
-            <w:r>
-              <w:t xml:space="preserve">MOD</w:t>
+              <w:t xml:space="preserve">D. N. Chi Nam</w:t>
+            </w:r>
+          </w:p>
+        </w:tc>
+        <w:tc>
+          <w:tcPr/>
+          <w:p>
+            <w:pPr>
+              <w:pStyle w:val="Compact"/>
+              <w:jc w:val="left"/>
+            </w:pPr>
+            <w:r>
+              <w:t xml:space="preserve">STRIDE: Spectral-Temporal Representation and Instance-Weighted Domain Expansion</w:t>
+            </w:r>
+          </w:p>
+        </w:tc>
+        <w:tc>
+          <w:tcPr/>
+          <w:p>
+            <w:pPr>
+              <w:pStyle w:val="Compact"/>
+              <w:jc w:val="left"/>
+            </w:pPr>
+            <w:r>
+              <w:t xml:space="preserve">2025 IEEE International Conference on Data Mining (ICDM)</w:t>
+            </w:r>
+          </w:p>
+        </w:tc>
+        <w:tc>
+          <w:tcPr/>
+          <w:p>
+            <w:pPr>
+              <w:pStyle w:val="Compact"/>
+              <w:jc w:val="left"/>
+            </w:pPr>
+            <w:r>
+              <w:t xml:space="preserve">NML</w:t>
             </w:r>
           </w:p>
         </w:tc>
@@ -27866,7 +27900,7 @@
               <w:jc w:val="left"/>
             </w:pPr>
             <w:r>
-              <w:t xml:space="preserve">10.1109/icccs65393.2025.11069655</w:t>
+              <w:t xml:space="preserve">10.1109/icdm65498.2025.00125</w:t>
             </w:r>
           </w:p>
         </w:tc>
@@ -27904,55 +27938,55 @@
               <w:jc w:val="left"/>
             </w:pPr>
             <w:r>
-              <w:t xml:space="preserve">D. N. Chi Nam</w:t>
-            </w:r>
-          </w:p>
-        </w:tc>
-        <w:tc>
-          <w:tcPr/>
-          <w:p>
-            <w:pPr>
-              <w:pStyle w:val="Compact"/>
-              <w:jc w:val="left"/>
-            </w:pPr>
-            <w:r>
-              <w:t xml:space="preserve">STRIDE: Spectral-Temporal Representation and Instance-Weighted Domain Expansion</w:t>
-            </w:r>
-          </w:p>
-        </w:tc>
-        <w:tc>
-          <w:tcPr/>
-          <w:p>
-            <w:pPr>
-              <w:pStyle w:val="Compact"/>
-              <w:jc w:val="left"/>
-            </w:pPr>
-            <w:r>
-              <w:t xml:space="preserve">2025 IEEE International Conference on Data Mining (ICDM)</w:t>
-            </w:r>
-          </w:p>
-        </w:tc>
-        <w:tc>
-          <w:tcPr/>
-          <w:p>
-            <w:pPr>
-              <w:pStyle w:val="Compact"/>
-              <w:jc w:val="left"/>
-            </w:pPr>
-            <w:r>
-              <w:t xml:space="preserve">NML</w:t>
-            </w:r>
-          </w:p>
-        </w:tc>
-        <w:tc>
-          <w:tcPr/>
-          <w:p>
-            <w:pPr>
-              <w:pStyle w:val="Compact"/>
-              <w:jc w:val="left"/>
-            </w:pPr>
-            <w:r>
-              <w:t xml:space="preserve">CLS</w:t>
+              <w:t xml:space="preserve">J. Li</w:t>
+            </w:r>
+          </w:p>
+        </w:tc>
+        <w:tc>
+          <w:tcPr/>
+          <w:p>
+            <w:pPr>
+              <w:pStyle w:val="Compact"/>
+              <w:jc w:val="left"/>
+            </w:pPr>
+            <w:r>
+              <w:t xml:space="preserve">MTSNN: A Few-Shot Fine-Grained Diagnosis Framework for Cross-Machine Fault Diagnosis With Heterogeneous Fault Categories</w:t>
+            </w:r>
+          </w:p>
+        </w:tc>
+        <w:tc>
+          <w:tcPr/>
+          <w:p>
+            <w:pPr>
+              <w:pStyle w:val="Compact"/>
+              <w:jc w:val="left"/>
+            </w:pPr>
+            <w:r>
+              <w:t xml:space="preserve">IEEE Transactions on Instrumentation and Measurement</w:t>
+            </w:r>
+          </w:p>
+        </w:tc>
+        <w:tc>
+          <w:tcPr/>
+          <w:p>
+            <w:pPr>
+              <w:pStyle w:val="Compact"/>
+              <w:jc w:val="left"/>
+            </w:pPr>
+            <w:r>
+              <w:t xml:space="preserve">MET</w:t>
+            </w:r>
+          </w:p>
+        </w:tc>
+        <w:tc>
+          <w:tcPr/>
+          <w:p>
+            <w:pPr>
+              <w:pStyle w:val="Compact"/>
+              <w:jc w:val="left"/>
+            </w:pPr>
+            <w:r>
+              <w:t xml:space="preserve">DIS</w:t>
             </w:r>
           </w:p>
         </w:tc>
@@ -27988,7 +28022,7 @@
               <w:jc w:val="left"/>
             </w:pPr>
             <w:r>
-              <w:t xml:space="preserve">10.1109/icdm65498.2025.00125</w:t>
+              <w:t xml:space="preserve">10.1109/tim.2025.3551907</w:t>
             </w:r>
           </w:p>
         </w:tc>
@@ -28026,55 +28060,55 @@
               <w:jc w:val="left"/>
             </w:pPr>
             <w:r>
-              <w:t xml:space="preserve">J. Li</w:t>
-            </w:r>
-          </w:p>
-        </w:tc>
-        <w:tc>
-          <w:tcPr/>
-          <w:p>
-            <w:pPr>
-              <w:pStyle w:val="Compact"/>
-              <w:jc w:val="left"/>
-            </w:pPr>
-            <w:r>
-              <w:t xml:space="preserve">MTSNN: A Few-Shot Fine-Grained Diagnosis Framework for Cross-Machine Fault Diagnosis With Heterogeneous Fault Categories</w:t>
-            </w:r>
-          </w:p>
-        </w:tc>
-        <w:tc>
-          <w:tcPr/>
-          <w:p>
-            <w:pPr>
-              <w:pStyle w:val="Compact"/>
-              <w:jc w:val="left"/>
-            </w:pPr>
-            <w:r>
-              <w:t xml:space="preserve">IEEE Transactions on Instrumentation and Measurement</w:t>
-            </w:r>
-          </w:p>
-        </w:tc>
-        <w:tc>
-          <w:tcPr/>
-          <w:p>
-            <w:pPr>
-              <w:pStyle w:val="Compact"/>
-              <w:jc w:val="left"/>
-            </w:pPr>
-            <w:r>
-              <w:t xml:space="preserve">MET</w:t>
-            </w:r>
-          </w:p>
-        </w:tc>
-        <w:tc>
-          <w:tcPr/>
-          <w:p>
-            <w:pPr>
-              <w:pStyle w:val="Compact"/>
-              <w:jc w:val="left"/>
-            </w:pPr>
-            <w:r>
-              <w:t xml:space="preserve">DIS</w:t>
+              <w:t xml:space="preserve">J. Xu</w:t>
+            </w:r>
+          </w:p>
+        </w:tc>
+        <w:tc>
+          <w:tcPr/>
+          <w:p>
+            <w:pPr>
+              <w:pStyle w:val="Compact"/>
+              <w:jc w:val="left"/>
+            </w:pPr>
+            <w:r>
+              <w:t xml:space="preserve">A Novel Approach for Small-Sample Open-Set Fault Diagnosis in Rolling Bearings: Dense-ProtoNet-AE</w:t>
+            </w:r>
+          </w:p>
+        </w:tc>
+        <w:tc>
+          <w:tcPr/>
+          <w:p>
+            <w:pPr>
+              <w:pStyle w:val="Compact"/>
+              <w:jc w:val="left"/>
+            </w:pPr>
+            <w:r>
+              <w:t xml:space="preserve">2025 CAA Symposium on Fault Detection, Supervision, and Safe</w:t>
+            </w:r>
+          </w:p>
+        </w:tc>
+        <w:tc>
+          <w:tcPr/>
+          <w:p>
+            <w:pPr>
+              <w:pStyle w:val="Compact"/>
+              <w:jc w:val="left"/>
+            </w:pPr>
+            <w:r>
+              <w:t xml:space="preserve">HYB</w:t>
+            </w:r>
+          </w:p>
+        </w:tc>
+        <w:tc>
+          <w:tcPr/>
+          <w:p>
+            <w:pPr>
+              <w:pStyle w:val="Compact"/>
+              <w:jc w:val="left"/>
+            </w:pPr>
+            <w:r>
+              <w:t xml:space="preserve">HYB</w:t>
             </w:r>
           </w:p>
         </w:tc>
@@ -28110,7 +28144,7 @@
               <w:jc w:val="left"/>
             </w:pPr>
             <w:r>
-              <w:t xml:space="preserve">10.1109/tim.2025.3551907</w:t>
+              <w:t xml:space="preserve">10.1109/safeprocess67117.2025.11268163</w:t>
             </w:r>
           </w:p>
         </w:tc>
@@ -28148,128 +28182,6 @@
               <w:jc w:val="left"/>
             </w:pPr>
             <w:r>
-              <w:t xml:space="preserve">J. Xu</w:t>
-            </w:r>
-          </w:p>
-        </w:tc>
-        <w:tc>
-          <w:tcPr/>
-          <w:p>
-            <w:pPr>
-              <w:pStyle w:val="Compact"/>
-              <w:jc w:val="left"/>
-            </w:pPr>
-            <w:r>
-              <w:t xml:space="preserve">A Novel Approach for Small-Sample Open-Set Fault Diagnosis in Rolling Bearings: Dense-ProtoNet-AE</w:t>
-            </w:r>
-          </w:p>
-        </w:tc>
-        <w:tc>
-          <w:tcPr/>
-          <w:p>
-            <w:pPr>
-              <w:pStyle w:val="Compact"/>
-              <w:jc w:val="left"/>
-            </w:pPr>
-            <w:r>
-              <w:t xml:space="preserve">2025 CAA Symposium on Fault Detection, Supervision, and Safe</w:t>
-            </w:r>
-          </w:p>
-        </w:tc>
-        <w:tc>
-          <w:tcPr/>
-          <w:p>
-            <w:pPr>
-              <w:pStyle w:val="Compact"/>
-              <w:jc w:val="left"/>
-            </w:pPr>
-            <w:r>
-              <w:t xml:space="preserve">HYB</w:t>
-            </w:r>
-          </w:p>
-        </w:tc>
-        <w:tc>
-          <w:tcPr/>
-          <w:p>
-            <w:pPr>
-              <w:pStyle w:val="Compact"/>
-              <w:jc w:val="left"/>
-            </w:pPr>
-            <w:r>
-              <w:t xml:space="preserve">HYB</w:t>
-            </w:r>
-          </w:p>
-        </w:tc>
-        <w:tc>
-          <w:tcPr/>
-          <w:p>
-            <w:pPr>
-              <w:pStyle w:val="Compact"/>
-              <w:jc w:val="left"/>
-            </w:pPr>
-            <w:r>
-              <w:t xml:space="preserve">STA</w:t>
-            </w:r>
-          </w:p>
-        </w:tc>
-        <w:tc>
-          <w:tcPr/>
-          <w:p>
-            <w:pPr>
-              <w:pStyle w:val="Compact"/>
-              <w:jc w:val="left"/>
-            </w:pPr>
-            <w:r>
-              <w:t xml:space="preserve">IOV</w:t>
-            </w:r>
-          </w:p>
-        </w:tc>
-        <w:tc>
-          <w:tcPr/>
-          <w:p>
-            <w:pPr>
-              <w:pStyle w:val="Compact"/>
-              <w:jc w:val="left"/>
-            </w:pPr>
-            <w:r>
-              <w:t xml:space="preserve">10.1109/safeprocess67117.2025.11268163</w:t>
-            </w:r>
-          </w:p>
-        </w:tc>
-      </w:tr>
-      <w:tr>
-        <w:tc>
-          <w:tcPr/>
-          <w:p>
-            <w:pPr>
-              <w:pStyle w:val="Compact"/>
-              <w:jc w:val="left"/>
-            </w:pPr>
-            <w:r>
-              <w:t xml:space="preserve">67</w:t>
-            </w:r>
-          </w:p>
-        </w:tc>
-        <w:tc>
-          <w:tcPr/>
-          <w:p>
-            <w:pPr>
-              <w:pStyle w:val="Compact"/>
-              <w:jc w:val="left"/>
-            </w:pPr>
-            <w:r>
-              <w:t xml:space="preserve">2025</w:t>
-            </w:r>
-          </w:p>
-        </w:tc>
-        <w:tc>
-          <w:tcPr/>
-          <w:p>
-            <w:pPr>
-              <w:pStyle w:val="Compact"/>
-              <w:jc w:val="left"/>
-            </w:pPr>
-            <w:r>
               <w:t xml:space="preserve">W. Guo</w:t>
             </w:r>
           </w:p>
@@ -28360,7 +28272,7 @@
         </w:tc>
       </w:tr>
     </w:tbl>
-    <w:bookmarkStart w:id="162" w:name="refs"/>
+    <w:bookmarkStart w:id="164" w:name="refs"/>
     <w:bookmarkStart w:id="83" w:name="ref-chandola2009survey"/>
     <w:p>
       <w:pPr>
@@ -30255,13 +30167,83 @@
       </w:r>
     </w:p>
     <w:bookmarkEnd w:id="136"/>
-    <w:bookmarkStart w:id="138" w:name="ref-zhang2020maml"/>
+    <w:bookmarkStart w:id="138" w:name="ref-xu2025swat"/>
     <w:p>
       <w:pPr>
         <w:pStyle w:val="Bibliography"/>
       </w:pPr>
       <w:r>
         <w:t xml:space="preserve">[37]</w:t>
+      </w:r>
+      <w:r>
+        <w:t xml:space="preserve"> </w:t>
+      </w:r>
+      <w:r>
+        <w:t xml:space="preserve">	</w:t>
+      </w:r>
+      <w:r>
+        <w:t xml:space="preserve">R. Xu, B. Yang, D. Zhao, F. Lv, and R. Sun,</w:t>
+      </w:r>
+      <w:r>
+        <w:t xml:space="preserve"> </w:t>
+      </w:r>
+      <w:r>
+        <w:t xml:space="preserve">“Cyber attack detection for industrial control systems with few-shot and class imbalance: An improved</w:t>
+      </w:r>
+      <w:r>
+        <w:t xml:space="preserve"> </w:t>
+      </w:r>
+      <w:r>
+        <w:t xml:space="preserve">DA-LSTM-UNet</w:t>
+      </w:r>
+      <w:r>
+        <w:t xml:space="preserve"> </w:t>
+      </w:r>
+      <w:r>
+        <w:t xml:space="preserve">scheme,”</w:t>
+      </w:r>
+      <w:r>
+        <w:t xml:space="preserve"> </w:t>
+      </w:r>
+      <w:r>
+        <w:t xml:space="preserve">in</w:t>
+      </w:r>
+      <w:r>
+        <w:t xml:space="preserve"> </w:t>
+      </w:r>
+      <w:r>
+        <w:rPr>
+          <w:iCs/>
+          <w:i/>
+        </w:rPr>
+        <w:t xml:space="preserve">2025 10th international conference on control, robotics and cybernetics (CRC)</w:t>
+      </w:r>
+      <w:r>
+        <w:t xml:space="preserve">, 2025, pp. 217–221. doi:</w:t>
+      </w:r>
+      <w:r>
+        <w:t xml:space="preserve"> </w:t>
+      </w:r>
+      <w:hyperlink r:id="rId137">
+        <w:r>
+          <w:rPr>
+            <w:rStyle w:val="Hyperlink"/>
+          </w:rPr>
+          <w:t xml:space="preserve">10.1109/CRC67523.2025.11288189</w:t>
+        </w:r>
+      </w:hyperlink>
+      <w:r>
+        <w:t xml:space="preserve">.</w:t>
+      </w:r>
+    </w:p>
+    <w:bookmarkEnd w:id="138"/>
+    <w:bookmarkStart w:id="140" w:name="ref-zhang2020maml"/>
+    <w:p>
+      <w:pPr>
+        <w:pStyle w:val="Bibliography"/>
+      </w:pPr>
+      <w:r>
+        <w:t xml:space="preserve">[38]</w:t>
       </w:r>
       <w:r>
         <w:t xml:space="preserve"> </w:t>
@@ -30300,7 +30282,7 @@
       <w:r>
         <w:t xml:space="preserve"> </w:t>
       </w:r>
-      <w:hyperlink r:id="rId137">
+      <w:hyperlink r:id="rId139">
         <w:r>
           <w:rPr>
             <w:rStyle w:val="Hyperlink"/>
@@ -30312,14 +30294,14 @@
         <w:t xml:space="preserve">.</w:t>
       </w:r>
     </w:p>
-    <w:bookmarkEnd w:id="138"/>
-    <w:bookmarkStart w:id="140" w:name="ref-zhou2021siamese"/>
+    <w:bookmarkEnd w:id="140"/>
+    <w:bookmarkStart w:id="142" w:name="ref-zhou2021siamese"/>
     <w:p>
       <w:pPr>
         <w:pStyle w:val="Bibliography"/>
       </w:pPr>
       <w:r>
-        <w:t xml:space="preserve">[38]</w:t>
+        <w:t xml:space="preserve">[39]</w:t>
       </w:r>
       <w:r>
         <w:t xml:space="preserve"> </w:t>
@@ -30352,7 +30334,7 @@
       <w:r>
         <w:t xml:space="preserve"> </w:t>
       </w:r>
-      <w:hyperlink r:id="rId139">
+      <w:hyperlink r:id="rId141">
         <w:r>
           <w:rPr>
             <w:rStyle w:val="Hyperlink"/>
@@ -30364,14 +30346,14 @@
         <w:t xml:space="preserve">.</w:t>
       </w:r>
     </w:p>
-    <w:bookmarkEnd w:id="140"/>
-    <w:bookmarkStart w:id="142" w:name="ref-chen2023metabearing"/>
+    <w:bookmarkEnd w:id="142"/>
+    <w:bookmarkStart w:id="144" w:name="ref-chen2023metabearing"/>
     <w:p>
       <w:pPr>
         <w:pStyle w:val="Bibliography"/>
       </w:pPr>
       <w:r>
-        <w:t xml:space="preserve">[39]</w:t>
+        <w:t xml:space="preserve">[40]</w:t>
       </w:r>
       <w:r>
         <w:t xml:space="preserve"> </w:t>
@@ -30404,7 +30386,7 @@
       <w:r>
         <w:t xml:space="preserve"> </w:t>
       </w:r>
-      <w:hyperlink r:id="rId141">
+      <w:hyperlink r:id="rId143">
         <w:r>
           <w:rPr>
             <w:rStyle w:val="Hyperlink"/>
@@ -30416,14 +30398,14 @@
         <w:t xml:space="preserve">.</w:t>
       </w:r>
     </w:p>
-    <w:bookmarkEnd w:id="142"/>
-    <w:bookmarkStart w:id="144" w:name="ref-li2024rrpn"/>
+    <w:bookmarkEnd w:id="144"/>
+    <w:bookmarkStart w:id="146" w:name="ref-li2024rrpn"/>
     <w:p>
       <w:pPr>
         <w:pStyle w:val="Bibliography"/>
       </w:pPr>
       <w:r>
-        <w:t xml:space="preserve">[40]</w:t>
+        <w:t xml:space="preserve">[41]</w:t>
       </w:r>
       <w:r>
         <w:t xml:space="preserve"> </w:t>
@@ -30456,7 +30438,7 @@
       <w:r>
         <w:t xml:space="preserve"> </w:t>
       </w:r>
-      <w:hyperlink r:id="rId143">
+      <w:hyperlink r:id="rId145">
         <w:r>
           <w:rPr>
             <w:rStyle w:val="Hyperlink"/>
@@ -30468,14 +30450,14 @@
         <w:t xml:space="preserve">.</w:t>
       </w:r>
     </w:p>
-    <w:bookmarkEnd w:id="144"/>
-    <w:bookmarkStart w:id="146" w:name="ref-kim2022rigorous"/>
+    <w:bookmarkEnd w:id="146"/>
+    <w:bookmarkStart w:id="148" w:name="ref-kim2022rigorous"/>
     <w:p>
       <w:pPr>
         <w:pStyle w:val="Bibliography"/>
       </w:pPr>
       <w:r>
-        <w:t xml:space="preserve">[41]</w:t>
+        <w:t xml:space="preserve">[42]</w:t>
       </w:r>
       <w:r>
         <w:t xml:space="preserve"> </w:t>
@@ -30514,7 +30496,7 @@
       <w:r>
         <w:t xml:space="preserve"> </w:t>
       </w:r>
-      <w:hyperlink r:id="rId145">
+      <w:hyperlink r:id="rId147">
         <w:r>
           <w:rPr>
             <w:rStyle w:val="Hyperlink"/>
@@ -30526,14 +30508,14 @@
         <w:t xml:space="preserve">.</w:t>
       </w:r>
     </w:p>
-    <w:bookmarkEnd w:id="146"/>
-    <w:bookmarkStart w:id="148" w:name="ref-garg2022evaluation"/>
+    <w:bookmarkEnd w:id="148"/>
+    <w:bookmarkStart w:id="150" w:name="ref-garg2022evaluation"/>
     <w:p>
       <w:pPr>
         <w:pStyle w:val="Bibliography"/>
       </w:pPr>
       <w:r>
-        <w:t xml:space="preserve">[42]</w:t>
+        <w:t xml:space="preserve">[43]</w:t>
       </w:r>
       <w:r>
         <w:t xml:space="preserve"> </w:t>
@@ -30566,7 +30548,7 @@
       <w:r>
         <w:t xml:space="preserve"> </w:t>
       </w:r>
-      <w:hyperlink r:id="rId147">
+      <w:hyperlink r:id="rId149">
         <w:r>
           <w:rPr>
             <w:rStyle w:val="Hyperlink"/>
@@ -30578,14 +30560,14 @@
         <w:t xml:space="preserve">.</w:t>
       </w:r>
     </w:p>
-    <w:bookmarkEnd w:id="148"/>
-    <w:bookmarkStart w:id="150" w:name="ref-wu2023flawed"/>
+    <w:bookmarkEnd w:id="150"/>
+    <w:bookmarkStart w:id="152" w:name="ref-wu2023flawed"/>
     <w:p>
       <w:pPr>
         <w:pStyle w:val="Bibliography"/>
       </w:pPr>
       <w:r>
-        <w:t xml:space="preserve">[43]</w:t>
+        <w:t xml:space="preserve">[44]</w:t>
       </w:r>
       <w:r>
         <w:t xml:space="preserve"> </w:t>
@@ -30618,7 +30600,7 @@
       <w:r>
         <w:t xml:space="preserve"> </w:t>
       </w:r>
-      <w:hyperlink r:id="rId149">
+      <w:hyperlink r:id="rId151">
         <w:r>
           <w:rPr>
             <w:rStyle w:val="Hyperlink"/>
@@ -30630,14 +30612,14 @@
         <w:t xml:space="preserve">.</w:t>
       </w:r>
     </w:p>
-    <w:bookmarkEnd w:id="150"/>
-    <w:bookmarkStart w:id="151" w:name="ref-siffer2017pot"/>
+    <w:bookmarkEnd w:id="152"/>
+    <w:bookmarkStart w:id="153" w:name="ref-siffer2017pot"/>
     <w:p>
       <w:pPr>
         <w:pStyle w:val="Bibliography"/>
       </w:pPr>
       <w:r>
-        <w:t xml:space="preserve">[44]</w:t>
+        <w:t xml:space="preserve">[45]</w:t>
       </w:r>
       <w:r>
         <w:t xml:space="preserve"> </w:t>
@@ -30674,14 +30656,14 @@
         <w:t xml:space="preserve">, 2017, pp. 1067–1075.</w:t>
       </w:r>
     </w:p>
-    <w:bookmarkEnd w:id="151"/>
-    <w:bookmarkStart w:id="152" w:name="ref-bach2008paired"/>
+    <w:bookmarkEnd w:id="153"/>
+    <w:bookmarkStart w:id="154" w:name="ref-bach2008paired"/>
     <w:p>
       <w:pPr>
         <w:pStyle w:val="Bibliography"/>
       </w:pPr>
       <w:r>
-        <w:t xml:space="preserve">[45]</w:t>
+        <w:t xml:space="preserve">[46]</w:t>
       </w:r>
       <w:r>
         <w:t xml:space="preserve"> </w:t>
@@ -30718,14 +30700,14 @@
         <w:t xml:space="preserve">, 2008, pp. 23–32.</w:t>
       </w:r>
     </w:p>
-    <w:bookmarkEnd w:id="152"/>
-    <w:bookmarkStart w:id="154" w:name="ref-su2019omnianomaly"/>
+    <w:bookmarkEnd w:id="154"/>
+    <w:bookmarkStart w:id="156" w:name="ref-su2019omnianomaly"/>
     <w:p>
       <w:pPr>
         <w:pStyle w:val="Bibliography"/>
       </w:pPr>
       <w:r>
-        <w:t xml:space="preserve">[46]</w:t>
+        <w:t xml:space="preserve">[47]</w:t>
       </w:r>
       <w:r>
         <w:t xml:space="preserve"> </w:t>
@@ -30764,7 +30746,7 @@
       <w:r>
         <w:t xml:space="preserve"> </w:t>
       </w:r>
-      <w:hyperlink r:id="rId153">
+      <w:hyperlink r:id="rId155">
         <w:r>
           <w:rPr>
             <w:rStyle w:val="Hyperlink"/>
@@ -30776,14 +30758,14 @@
         <w:t xml:space="preserve">.</w:t>
       </w:r>
     </w:p>
-    <w:bookmarkEnd w:id="154"/>
-    <w:bookmarkStart w:id="157" w:name="ref-katser2020skab"/>
+    <w:bookmarkEnd w:id="156"/>
+    <w:bookmarkStart w:id="159" w:name="ref-katser2020skab"/>
     <w:p>
       <w:pPr>
         <w:pStyle w:val="Bibliography"/>
       </w:pPr>
       <w:r>
-        <w:t xml:space="preserve">[47]</w:t>
+        <w:t xml:space="preserve">[48]</w:t>
       </w:r>
       <w:r>
         <w:t xml:space="preserve"> </w:t>
@@ -30809,7 +30791,7 @@
       <w:r>
         <w:t xml:space="preserve"> </w:t>
       </w:r>
-      <w:hyperlink r:id="rId155">
+      <w:hyperlink r:id="rId157">
         <w:r>
           <w:rPr>
             <w:rStyle w:val="Hyperlink"/>
@@ -30823,7 +30805,7 @@
       <w:r>
         <w:t xml:space="preserve"> </w:t>
       </w:r>
-      <w:hyperlink r:id="rId156">
+      <w:hyperlink r:id="rId158">
         <w:r>
           <w:rPr>
             <w:rStyle w:val="Hyperlink"/>
@@ -30835,14 +30817,14 @@
         <w:t xml:space="preserve">.</w:t>
       </w:r>
     </w:p>
-    <w:bookmarkEnd w:id="157"/>
-    <w:bookmarkStart w:id="159" w:name="ref-abdulaal2021psm"/>
+    <w:bookmarkEnd w:id="159"/>
+    <w:bookmarkStart w:id="161" w:name="ref-abdulaal2021psm"/>
     <w:p>
       <w:pPr>
         <w:pStyle w:val="Bibliography"/>
       </w:pPr>
       <w:r>
-        <w:t xml:space="preserve">[48]</w:t>
+        <w:t xml:space="preserve">[49]</w:t>
       </w:r>
       <w:r>
         <w:t xml:space="preserve"> </w:t>
@@ -30881,7 +30863,7 @@
       <w:r>
         <w:t xml:space="preserve"> </w:t>
       </w:r>
-      <w:hyperlink r:id="rId158">
+      <w:hyperlink r:id="rId160">
         <w:r>
           <w:rPr>
             <w:rStyle w:val="Hyperlink"/>
@@ -30893,14 +30875,14 @@
         <w:t xml:space="preserve">.</w:t>
       </w:r>
     </w:p>
-    <w:bookmarkEnd w:id="159"/>
-    <w:bookmarkStart w:id="161" w:name="ref-liu2008iforest"/>
+    <w:bookmarkEnd w:id="161"/>
+    <w:bookmarkStart w:id="163" w:name="ref-liu2008iforest"/>
     <w:p>
       <w:pPr>
         <w:pStyle w:val="Bibliography"/>
       </w:pPr>
       <w:r>
-        <w:t xml:space="preserve">[49]</w:t>
+        <w:t xml:space="preserve">[50]</w:t>
       </w:r>
       <w:r>
         <w:t xml:space="preserve"> </w:t>
@@ -30939,7 +30921,7 @@
       <w:r>
         <w:t xml:space="preserve"> </w:t>
       </w:r>
-      <w:hyperlink r:id="rId160">
+      <w:hyperlink r:id="rId162">
         <w:r>
           <w:rPr>
             <w:rStyle w:val="Hyperlink"/>
@@ -30951,9 +30933,9 @@
         <w:t xml:space="preserve">.</w:t>
       </w:r>
     </w:p>
-    <w:bookmarkEnd w:id="161"/>
-    <w:bookmarkEnd w:id="162"/>
     <w:bookmarkEnd w:id="163"/>
+    <w:bookmarkEnd w:id="164"/>
+    <w:bookmarkEnd w:id="165"/>
     <w:sectPr/>
   </w:body>
 </w:document>

</xml_diff>